<commit_message>
Vaughan: platform name on the dashboard, README and technical report (package and URLs unchanged)
</commit_message>
<xml_diff>
--- a/docs/milton_da_technical_report.docx
+++ b/docs/milton_da_technical_report.docx
@@ -20,7 +20,7 @@
           <w:sz w:val="44"/>
           <w:szCs w:val="44"/>
         </w:rPr>
-        <w:t xml:space="preserve">Physics-Guided Score-Based Data Assimilation for Three-Dimensional Hurricane Structure Retrieval</w:t>
+        <w:t xml:space="preserve">Vaughan: Physics-Guided Score-Based Data Assimilation for Three-Dimensional Hurricane Structure Retrieval</w:t>
       </w:r>
     </w:p>
     <w:p>
@@ -66,7 +66,7 @@
           <w:sz w:val="24"/>
           <w:szCs w:val="24"/>
         </w:rPr>
-        <w:t xml:space="preserve">Software package: milton_da v0.2.0 (github.com/Ibekwemmanuel7/milton_da). Results dashboard: ibekwemmanuel7.github.io/milton_da/dashboard</w:t>
+        <w:t xml:space="preserve">Platform: Vaughan. Software package: milton_da v0.2.0 (github.com/Ibekwemmanuel7/milton_da). Results dashboard: ibekwemmanuel7.github.io/milton_da/dashboard</w:t>
       </w:r>
     </w:p>
     <w:p>
@@ -19345,7 +19345,7 @@
           <w:sz w:val="24"/>
           <w:szCs w:val="24"/>
         </w:rPr>
-        <w:t xml:space="preserve">The results live on a single self-contained web page, Milton Inside Out, served from the project repository at https://ibekwemmanuel7.github.io/milton_da/dashboard/ and kept in dashboard/index.html. It is one HTML file of about 6 MB with the GOES imagery, the retrieval fields, the audit and the comparison tables embedded, so it works offline once loaded, needs no server, and can be handed to anyone as a file or a link. This section walks through the page from top to bottom and explains, for each element, what is plotted, from which data, how the numbers were computed, how to read it, and the questions it tends to raise. It is written to be read once alongside the page and then used as a reference before a presentation.</w:t>
+        <w:t xml:space="preserve">The results live on a single self-contained web page, Vaughan (Milton Inside Out), served from the project repository at https://ibekwemmanuel7.github.io/milton_da/dashboard/ and kept in dashboard/index.html. It is one HTML file of about 6 MB with the GOES imagery, the retrieval fields, the audit and the comparison tables embedded, so it works offline once loaded, needs no server, and can be handed to anyone as a file or a link. This section walks through the page from top to bottom and explains, for each element, what is plotted, from which data, how the numbers were computed, how to read it, and the questions it tends to raise. It is written to be read once alongside the page and then used as a reference before a presentation.</w:t>
       </w:r>
     </w:p>
     <w:p>
@@ -31488,7 +31488,7 @@
         <w:sz w:val="18"/>
         <w:szCs w:val="18"/>
       </w:rPr>
-      <w:t xml:space="preserve">milton_da technical report</w:t>
+      <w:t xml:space="preserve">Vaughan (milton_da) technical report</w:t>
     </w:r>
   </w:p>
 </w:hdr>

</xml_diff>

<commit_message>
Vaughan: platform name and logo on the dashboard, README and technical report
</commit_message>
<xml_diff>
--- a/docs/milton_da_technical_report.docx
+++ b/docs/milton_da_technical_report.docx
@@ -4,477 +4,18 @@
   <w:body>
     <w:p>
       <w:pPr>
-        <w:spacing w:before="1200"/>
+        <w:spacing w:before="700"/>
       </w:pPr>
     </w:p>
     <w:p>
       <w:pPr>
-        <w:spacing w:after="240"/>
-        <w:jc w:val="center"/>
-      </w:pPr>
-      <w:r>
-        <w:rPr>
-          <w:rFonts w:ascii="Times New Roman" w:cs="Times New Roman" w:eastAsia="Times New Roman" w:hAnsi="Times New Roman"/>
-          <w:b/>
-          <w:bCs/>
-          <w:sz w:val="44"/>
-          <w:szCs w:val="44"/>
-        </w:rPr>
-        <w:t xml:space="preserve">Vaughan: Physics-Guided Score-Based Data Assimilation for Three-Dimensional Hurricane Structure Retrieval</w:t>
-      </w:r>
-    </w:p>
-    <w:p>
-      <w:pPr>
-        <w:spacing w:after="600"/>
-        <w:jc w:val="center"/>
-      </w:pPr>
-      <w:r>
-        <w:rPr>
-          <w:rFonts w:ascii="Times New Roman" w:cs="Times New Roman" w:eastAsia="Times New Roman" w:hAnsi="Times New Roman"/>
-          <w:i/>
-          <w:iCs/>
-          <w:sz w:val="26"/>
-          <w:szCs w:val="26"/>
-        </w:rPr>
-        <w:t xml:space="preserve">Multi-modal fusion of GOES-16 infrared imagery and ATMS microwave soundings with a conditional diffusion prior and a differentiable radiative-transfer constraint, applied to Hurricane Milton (October 2024)</w:t>
-      </w:r>
-    </w:p>
-    <w:p>
-      <w:pPr>
-        <w:spacing w:after="120"/>
-        <w:jc w:val="center"/>
-      </w:pPr>
-      <w:r>
-        <w:rPr>
-          <w:rFonts w:ascii="Times New Roman" w:cs="Times New Roman" w:eastAsia="Times New Roman" w:hAnsi="Times New Roman"/>
-          <w:b/>
-          <w:bCs/>
-          <w:sz w:val="28"/>
-          <w:szCs w:val="28"/>
-        </w:rPr>
-        <w:t xml:space="preserve">Technical Report</w:t>
-      </w:r>
-    </w:p>
-    <w:p>
-      <w:pPr>
-        <w:spacing w:after="120"/>
-        <w:jc w:val="center"/>
-      </w:pPr>
-      <w:r>
-        <w:rPr>
-          <w:rFonts w:ascii="Times New Roman" w:cs="Times New Roman" w:eastAsia="Times New Roman" w:hAnsi="Times New Roman"/>
-          <w:sz w:val="24"/>
-          <w:szCs w:val="24"/>
-        </w:rPr>
-        <w:t xml:space="preserve">Platform: Vaughan. Software package: milton_da v0.2.0 (github.com/Ibekwemmanuel7/milton_da). Results dashboard: ibekwemmanuel7.github.io/milton_da/dashboard</w:t>
-      </w:r>
-    </w:p>
-    <w:p>
-      <w:pPr>
-        <w:spacing w:after="120"/>
-        <w:jc w:val="center"/>
-      </w:pPr>
-      <w:r>
-        <w:rPr>
-          <w:rFonts w:ascii="Times New Roman" w:cs="Times New Roman" w:eastAsia="Times New Roman" w:hAnsi="Times New Roman"/>
-          <w:sz w:val="24"/>
-          <w:szCs w:val="24"/>
-        </w:rPr>
-        <w:t xml:space="preserve">Author: Emmanuel Chidi Ibekwe</w:t>
-      </w:r>
-    </w:p>
-    <w:p>
-      <w:pPr>
-        <w:spacing w:after="500"/>
-        <w:jc w:val="center"/>
-      </w:pPr>
-      <w:r>
-        <w:rPr>
-          <w:rFonts w:ascii="Times New Roman" w:cs="Times New Roman" w:eastAsia="Times New Roman" w:hAnsi="Times New Roman"/>
-          <w:sz w:val="24"/>
-          <w:szCs w:val="24"/>
-        </w:rPr>
-        <w:t xml:space="preserve">September 2026</w:t>
-      </w:r>
-    </w:p>
-    <w:p>
-      <w:pPr>
-        <w:spacing w:after="120"/>
-        <w:jc w:val="center"/>
-      </w:pPr>
-      <w:r>
-        <w:rPr>
-          <w:rFonts w:ascii="Times New Roman" w:cs="Times New Roman" w:eastAsia="Times New Roman" w:hAnsi="Times New Roman"/>
-          <w:b/>
-          <w:bCs/>
-          <w:sz w:val="24"/>
-          <w:szCs w:val="24"/>
-        </w:rPr>
-        <w:t xml:space="preserve">Abstract</w:t>
-      </w:r>
-    </w:p>
-    <w:p>
-      <w:pPr>
-        <w:spacing w:after="160" w:line="300"/>
-        <w:jc w:val="both"/>
-      </w:pPr>
-      <w:r>
-        <w:rPr>
-          <w:rFonts w:ascii="Times New Roman" w:cs="Times New Roman" w:eastAsia="Times New Roman" w:hAnsi="Times New Roman"/>
-          <w:sz w:val="21"/>
-          <w:szCs w:val="21"/>
-        </w:rPr>
-        <w:t xml:space="preserve">This report documents the design, implementation, verification and real-data results of milton_da, a modular PyTorch system that reconstructs the three-dimensional temperature field (200 to 1000 hPa) and the surface precipitation field of a tropical cyclone from satellite observations alone, with no forecast model. Geostationary infrared imagery (GOES-16 ABI) and polar-orbiting microwave soundings (NOAA-20 ATMS) are co-registered on a storm-centred grid, fused by a U-Net whose infrared feature maps attend over microwave tokens, and assimilated by a physics-guided score-based diffusion sampler whose likelihood combines the U-Net proxy, a per-channel calibrated radiative-transfer operator and a static-stability constraint. Applied to 16 analysis times of Hurricane Milton (6 to 10 October 2024), with the prior and proxy trained on 805 storm-centred scenes from 2017 to 2022 and Milton held out, the 8-member analysis places the warm core at 250 to 400 hPa in 15 of 16 scenes, agrees with ERA5 to 1.0 to 2.8 K over the domain and 1.1 K in the inner core on scenes with a sounder overpass, and fits the bias-corrected ATMS sounding channels to 1.5 to 2.8 K, below the 2.5 to 3 K the reanalysis truth itself achieves. Two findings on real data shaped the final design: a channel-by-channel audit of the analytic operator against truth showed the oxygen sounding channels to be usable after a constant 14 to 23 K correction and the window channels unusable under an ice canopy, and an instrumented chain showed that likelihood guidance applied before the Tweedie estimate is meaningful drives the sampler off the data manifold, which a Tweedie-variance inflation of the observation errors and an early gate resolve (15.9 K to 1.7 K on the test scene). A three-way comparison shows the full system and the direct proxy agreeing to 0.01 K, the conclusion Tomorrow.io reported for ICGen, while a physics-only experiment shows the likelihood fitting the radiances without retraining at the cost of the resolution a 16 x 16 sounder grid cannot supply. The report closes with a guide to the results dashboard, the position of the work relative to Tomorrow.io's published sounder papers, and recommendations.</w:t>
-      </w:r>
-    </w:p>
-    <w:p>
-      <w:r>
-        <w:br w:type="page"/>
-      </w:r>
-    </w:p>
-    <w:p>
-      <w:pPr>
         <w:spacing w:after="200"/>
-      </w:pPr>
-      <w:r>
-        <w:rPr>
-          <w:rFonts w:ascii="Times New Roman" w:cs="Times New Roman" w:eastAsia="Times New Roman" w:hAnsi="Times New Roman"/>
-          <w:b/>
-          <w:bCs/>
-          <w:sz w:val="32"/>
-          <w:szCs w:val="32"/>
-        </w:rPr>
-        <w:t xml:space="preserve">Contents</w:t>
-      </w:r>
-    </w:p>
-    <w:sdt>
-      <w:sdtPr>
-        <w:alias w:val="Contents"/>
-      </w:sdtPr>
-      <w:sdtContent>
-        <w:p>
-          <w:r>
-            <w:fldChar w:fldCharType="begin" w:dirty="true"/>
-            <w:instrText xml:space="preserve">TOC \h \o "1-2"</w:instrText>
-            <w:fldChar w:fldCharType="separate"/>
-          </w:r>
-        </w:p>
-        <w:p>
-          <w:r>
-            <w:fldChar w:fldCharType="end"/>
-          </w:r>
-        </w:p>
-      </w:sdtContent>
-    </w:sdt>
-    <w:p>
-      <w:r>
-        <w:br w:type="page"/>
-      </w:r>
-    </w:p>
-    <w:p>
-      <w:pPr>
-        <w:pStyle w:val="Heading1"/>
-        <w:spacing w:after="160" w:before="360"/>
-      </w:pPr>
-      <w:r>
-        <w:rPr>
-          <w:rFonts w:ascii="Times New Roman" w:cs="Times New Roman" w:eastAsia="Times New Roman" w:hAnsi="Times New Roman"/>
-        </w:rPr>
-        <w:t xml:space="preserve">1. Executive Summary</w:t>
-      </w:r>
-    </w:p>
-    <w:p>
-      <w:pPr>
-        <w:spacing w:after="160" w:line="300"/>
-        <w:jc w:val="both"/>
-      </w:pPr>
-      <w:r>
-        <w:rPr>
-          <w:rFonts w:ascii="Times New Roman" w:cs="Times New Roman" w:eastAsia="Times New Roman" w:hAnsi="Times New Roman"/>
-          <w:sz w:val="24"/>
-          <w:szCs w:val="24"/>
-        </w:rPr>
-        <w:t xml:space="preserve">Tropical cyclones are observed almost continuously from geostationary orbit, but only their cloud tops. The structure that determines intensity, the warm core aloft and the eyewall precipitation, is visible only to microwave sounders on polar orbiters, which pass a given storm a few times a day at a resolution of tens of kilometres. Operational centres bridge this gap with numerical weather prediction and variational data assimilation, a procedure that costs hours of supercomputer time per analysis cycle. This project replaces that procedure with a generative machine-learning inverse solver that ingests the two satellite data streams and produces a full three-dimensional diagnostic state in a few minutes on a single GPU, and it has been run end to end on real observations of Hurricane Milton, the most rapidly intensifying Gulf hurricane on record.</w:t>
-      </w:r>
-    </w:p>
-    <w:p>
-      <w:pPr>
-        <w:spacing w:after="160" w:line="300"/>
-        <w:jc w:val="both"/>
-      </w:pPr>
-      <w:r>
-        <w:rPr>
-          <w:rFonts w:ascii="Times New Roman" w:cs="Times New Roman" w:eastAsia="Times New Roman" w:hAnsi="Times New Roman"/>
-          <w:sz w:val="24"/>
-          <w:szCs w:val="24"/>
-        </w:rPr>
-        <w:t xml:space="preserve">The system has three learned or physical components. The first is a Cross-Attention U-Net that produces a deterministic multi-channel proxy of the state: the infrared image is encoded at full resolution and, at the two deepest levels of both the encoder and decoder, every infrared pixel attends over the entire grid of microwave sounder tokens, so the deep-atmosphere signal captured only by the sounder is redistributed spatially by the fine infrared texture. The second is an unconditional score-based diffusion prior trained purely on reanalysis states, which encodes what physically realised hurricane structures look like. The third is a differentiable radiative-transfer operator together with a thermodynamic penalty; both are placed inside the reverse-diffusion loop so that every sample is pulled toward states whose simulated brightness temperatures match the satellites and whose lapse rates never exceed the dry adiabat.</w:t>
-      </w:r>
-    </w:p>
-    <w:p>
-      <w:pPr>
-        <w:spacing w:after="160" w:line="300"/>
-        <w:jc w:val="both"/>
-      </w:pPr>
-      <w:r>
-        <w:rPr>
-          <w:rFonts w:ascii="Times New Roman" w:cs="Times New Roman" w:eastAsia="Times New Roman" w:hAnsi="Times New Roman"/>
-          <w:sz w:val="24"/>
-          <w:szCs w:val="24"/>
-        </w:rPr>
-        <w:t xml:space="preserve">On Milton the system works, and the path to making it work is the substance of this report. The first retrieval on real data was wrong in a diagnosable way; an audit of the observation operator against reanalysis truth sorted the satellite channels into the five that can be trusted after a constant correction and the seven that cannot be represented without cloud physics, and an instrumented sampling chain exposed a guidance schedule that pushed samples off the data manifold. With both corrected, the analysis places Milton's warm core at 250 to 400 hPa in 15 of 16 analysis times, matches ERA5 to about 1 K in the inner core where a sounder overpass exists, and fits the sounding channels to their noise floor. A three-way comparison against the direct proxy and a physics-only retrieval gives a measured answer to whether the generative step is worth its cost: not when the proxy is in distribution, which is also Tomorrow.io's finding, and yes when the proxy has not seen the observation, where the physics carries it at the cost of resolution. Section 14 is a guide to the interactive results page and Section 15 sets the work beside Tomorrow.io's published sounder papers.</w:t>
-      </w:r>
-    </w:p>
-    <w:p>
-      <w:pPr>
-        <w:spacing w:after="160" w:line="300"/>
-        <w:jc w:val="both"/>
-      </w:pPr>
-      <w:r>
-        <w:rPr>
-          <w:rFonts w:ascii="Times New Roman" w:cs="Times New Roman" w:eastAsia="Times New Roman" w:hAnsi="Times New Roman"/>
-          <w:sz w:val="24"/>
-          <w:szCs w:val="24"/>
-        </w:rPr>
-        <w:t xml:space="preserve">The package is complete and tested. It comprises about 3,000 lines across 26 modules, including an xarray-based ingestion layer with exact geostationary inverse projection, swath interpolation with coverage masks and reanalysis regridding; the two networks; a variance-preserving SDE with Tweedie denoising; the physics operators; a predictor-corrector guided sampler; training loops with mixed precision and exponential moving averages; a CLI that writes CF-compliant NetCDF analyses; an archive-access layer with drivers for the Milton case and a multi-storm training archive; and a nine-test suite that runs on a CPU in under half a minute. The remainder of this report describes each component at the level of equations and tensor shapes, presents the synthetic verification, the real-data results and their diagnosis, the dashboard guide, and the limitations that separate this prototype from an operational system.</w:t>
-      </w:r>
-    </w:p>
-    <w:p>
-      <w:pPr>
-        <w:pStyle w:val="Heading1"/>
-        <w:spacing w:after="160" w:before="360"/>
-      </w:pPr>
-      <w:r>
-        <w:rPr>
-          <w:rFonts w:ascii="Times New Roman" w:cs="Times New Roman" w:eastAsia="Times New Roman" w:hAnsi="Times New Roman"/>
-        </w:rPr>
-        <w:t xml:space="preserve">2. Scientific Motivation and Problem Statement</w:t>
-      </w:r>
-    </w:p>
-    <w:p>
-      <w:pPr>
-        <w:pStyle w:val="Heading2"/>
-        <w:spacing w:after="120" w:before="280"/>
-      </w:pPr>
-      <w:r>
-        <w:rPr>
-          <w:rFonts w:ascii="Times New Roman" w:cs="Times New Roman" w:eastAsia="Times New Roman" w:hAnsi="Times New Roman"/>
-        </w:rPr>
-        <w:t xml:space="preserve">2.1 The observational gap</w:t>
-      </w:r>
-    </w:p>
-    <w:p>
-      <w:pPr>
-        <w:spacing w:after="160" w:line="300"/>
-        <w:jc w:val="both"/>
-      </w:pPr>
-      <w:r>
-        <w:rPr>
-          <w:rFonts w:ascii="Times New Roman" w:cs="Times New Roman" w:eastAsia="Times New Roman" w:hAnsi="Times New Roman"/>
-          <w:sz w:val="24"/>
-          <w:szCs w:val="24"/>
-        </w:rPr>
-        <w:t xml:space="preserve">The Advanced Baseline Imager on GOES-16 returns a full-disk image every ten minutes and a mesoscale sector every thirty seconds, at a nadir resolution of two kilometres in the infrared. Channel 13 (10.3 micrometres) is a clean window channel whose brightness temperature is, under opaque cloud, the temperature at cloud top; channels 8 and 10 (6.2 and 7.3 micrometres) are water-vapour channels whose weighting functions peak in the upper and middle troposphere. None of these channels penetrates the cirrus canopy of a mature hurricane, so the imager sees a smooth cold shield with an eye, not the eyewall or the warm core.</w:t>
-      </w:r>
-    </w:p>
-    <w:p>
-      <w:pPr>
-        <w:spacing w:after="160" w:line="300"/>
-        <w:jc w:val="both"/>
-      </w:pPr>
-      <w:r>
-        <w:rPr>
-          <w:rFonts w:ascii="Times New Roman" w:cs="Times New Roman" w:eastAsia="Times New Roman" w:hAnsi="Times New Roman"/>
-          <w:sz w:val="24"/>
-          <w:szCs w:val="24"/>
-        </w:rPr>
-        <w:t xml:space="preserve">The Advanced Technology Microwave Sounder on Suomi-NPP, NOAA-20 and NOAA-21 measures in the 50 to 57 GHz oxygen absorption band, where ice cloud is nearly transparent. Channels 5 to 9 have weighting functions that peak from the boundary layer to the lower stratosphere, and their combination is a coarse temperature profile; channel 7 (54.4 GHz), peaking near 400 hPa, sees the warm-core anomaly directly. Higher-frequency channels at 88, 165 and 183 GHz are depressed by scattering from precipitation-sized ice and therefore map the eyewall and rainbands. The cost is resolution and cadence: the 50 GHz footprint is about 32 km at nadir and the sun-synchronous orbit yields a handful of overpasses per day, frequently with the storm at the swath edge or missed entirely.</w:t>
-      </w:r>
-    </w:p>
-    <w:p>
-      <w:pPr>
-        <w:pStyle w:val="Heading2"/>
-        <w:spacing w:after="120" w:before="280"/>
-      </w:pPr>
-      <w:r>
-        <w:rPr>
-          <w:rFonts w:ascii="Times New Roman" w:cs="Times New Roman" w:eastAsia="Times New Roman" w:hAnsi="Times New Roman"/>
-        </w:rPr>
-        <w:t xml:space="preserve">2.2 The data-assimilation bottleneck</w:t>
-      </w:r>
-    </w:p>
-    <w:p>
-      <w:pPr>
-        <w:spacing w:after="160" w:line="300"/>
-        <w:jc w:val="both"/>
-      </w:pPr>
-      <w:r>
-        <w:rPr>
-          <w:rFonts w:ascii="Times New Roman" w:cs="Times New Roman" w:eastAsia="Times New Roman" w:hAnsi="Times New Roman"/>
-          <w:sz w:val="24"/>
-          <w:szCs w:val="24"/>
-        </w:rPr>
-        <w:t xml:space="preserve">Operational analyses combine these observations with a short-range forecast through 4D-Var or ensemble Kalman methods. Both require the forward observation operator (a radiative-transfer model such as CRTM or RTTOV) and, for 4D-Var, its tangent-linear and adjoint, evaluated repeatedly inside an iterative minimisation coupled to the full forecast model. The wall-clock cost of a global cycle is measured in hours, and regional hurricane systems such as HAFS carry a similar burden. For rapidly intensifying storms, Milton being a canonical example, the analysis is stale by the time it is issued.</w:t>
-      </w:r>
-    </w:p>
-    <w:p>
-      <w:pPr>
-        <w:pStyle w:val="Heading2"/>
-        <w:spacing w:after="120" w:before="280"/>
-      </w:pPr>
-      <w:r>
-        <w:rPr>
-          <w:rFonts w:ascii="Times New Roman" w:cs="Times New Roman" w:eastAsia="Times New Roman" w:hAnsi="Times New Roman"/>
-        </w:rPr>
-        <w:t xml:space="preserve">2.3 The hallucination problem</w:t>
-      </w:r>
-    </w:p>
-    <w:p>
-      <w:pPr>
-        <w:spacing w:after="160" w:line="300"/>
-        <w:jc w:val="both"/>
-      </w:pPr>
-      <w:r>
-        <w:rPr>
-          <w:rFonts w:ascii="Times New Roman" w:cs="Times New Roman" w:eastAsia="Times New Roman" w:hAnsi="Times New Roman"/>
-          <w:sz w:val="24"/>
-          <w:szCs w:val="24"/>
-        </w:rPr>
-        <w:t xml:space="preserve">A straightforward alternative is to regress the reanalysis state directly from the satellite images with a convolutional network. Such regressors minimise a pixelwise loss and therefore return the conditional mean, which is spatially blurred wherever the observations are ambiguous; they also have no mechanism that forbids a temperature profile with a super-adiabatic layer or a precipitation field inconsistent with the cloud-top temperatures that were used to infer it. In data-assimilation language, a regressor has no background-error covariance and no observation operator. The generative approach adopted here restores both: the diffusion prior plays the role of a flow-dependent background distribution, and the radiative-transfer operator inside the likelihood plays the role of the observation term.</w:t>
-      </w:r>
-    </w:p>
-    <w:p>
-      <w:pPr>
-        <w:pStyle w:val="Heading2"/>
-        <w:spacing w:after="120" w:before="280"/>
-      </w:pPr>
-      <w:r>
-        <w:rPr>
-          <w:rFonts w:ascii="Times New Roman" w:cs="Times New Roman" w:eastAsia="Times New Roman" w:hAnsi="Times New Roman"/>
-        </w:rPr>
-        <w:t xml:space="preserve">2.4 Objectives</w:t>
-      </w:r>
-    </w:p>
-    <w:p>
-      <w:pPr>
-        <w:pStyle w:val="ListParagraph"/>
-        <w:numPr>
-          <w:ilvl w:val="0"/>
-          <w:numId w:val="2"/>
-        </w:numPr>
-        <w:spacing w:after="80" w:line="280"/>
-      </w:pPr>
-      <w:r>
-        <w:rPr>
-          <w:rFonts w:ascii="Times New Roman" w:cs="Times New Roman" w:eastAsia="Times New Roman" w:hAnsi="Times New Roman"/>
-          <w:b/>
-          <w:bCs/>
-          <w:sz w:val="24"/>
-          <w:szCs w:val="24"/>
-        </w:rPr>
-        <w:t xml:space="preserve">Multi-modal fusion. </w:t>
-      </w:r>
-      <w:r>
-        <w:rPr>
-          <w:rFonts w:ascii="Times New Roman" w:cs="Times New Roman" w:eastAsia="Times New Roman" w:hAnsi="Times New Roman"/>
-          <w:sz w:val="24"/>
-          <w:szCs w:val="24"/>
-        </w:rPr>
-        <w:t xml:space="preserve">Blend unaligned infrared and microwave grids with a Cross-Attention U-Net so that the fine infrared texture guides and up-scales the deep-atmosphere signal from the sounder.</w:t>
-      </w:r>
-    </w:p>
-    <w:p>
-      <w:pPr>
-        <w:pStyle w:val="ListParagraph"/>
-        <w:numPr>
-          <w:ilvl w:val="0"/>
-          <w:numId w:val="2"/>
-        </w:numPr>
-        <w:spacing w:after="80" w:line="280"/>
-      </w:pPr>
-      <w:r>
-        <w:rPr>
-          <w:rFonts w:ascii="Times New Roman" w:cs="Times New Roman" w:eastAsia="Times New Roman" w:hAnsi="Times New Roman"/>
-          <w:b/>
-          <w:bCs/>
-          <w:sz w:val="24"/>
-          <w:szCs w:val="24"/>
-        </w:rPr>
-        <w:t xml:space="preserve">Real-time assimilation. </w:t>
-      </w:r>
-      <w:r>
-        <w:rPr>
-          <w:rFonts w:ascii="Times New Roman" w:cs="Times New Roman" w:eastAsia="Times New Roman" w:hAnsi="Times New Roman"/>
-          <w:sz w:val="24"/>
-          <w:szCs w:val="24"/>
-        </w:rPr>
-        <w:t xml:space="preserve">Replace the variational minimisation with a conditional score-based sampler that returns a physically consistent three-dimensional grid and its uncertainty in seconds.</w:t>
-      </w:r>
-    </w:p>
-    <w:p>
-      <w:pPr>
-        <w:pStyle w:val="ListParagraph"/>
-        <w:numPr>
-          <w:ilvl w:val="0"/>
-          <w:numId w:val="2"/>
-        </w:numPr>
-        <w:spacing w:after="80" w:line="280"/>
-      </w:pPr>
-      <w:r>
-        <w:rPr>
-          <w:rFonts w:ascii="Times New Roman" w:cs="Times New Roman" w:eastAsia="Times New Roman" w:hAnsi="Times New Roman"/>
-          <w:b/>
-          <w:bCs/>
-          <w:sz w:val="24"/>
-          <w:szCs w:val="24"/>
-        </w:rPr>
-        <w:t xml:space="preserve">Physical integrity. </w:t>
-      </w:r>
-      <w:r>
-        <w:rPr>
-          <w:rFonts w:ascii="Times New Roman" w:cs="Times New Roman" w:eastAsia="Times New Roman" w:hAnsi="Times New Roman"/>
-          <w:sz w:val="24"/>
-          <w:szCs w:val="24"/>
-        </w:rPr>
-        <w:t xml:space="preserve">Enforce radiative consistency with the observed brightness temperatures and thermodynamic consistency (static stability, non-negative rain) inside the generative loop rather than as a post-hoc filter.</w:t>
-      </w:r>
-    </w:p>
-    <w:p>
-      <w:pPr>
-        <w:pStyle w:val="Heading1"/>
-        <w:spacing w:after="160" w:before="360"/>
-      </w:pPr>
-      <w:r>
-        <w:rPr>
-          <w:rFonts w:ascii="Times New Roman" w:cs="Times New Roman" w:eastAsia="Times New Roman" w:hAnsi="Times New Roman"/>
-        </w:rPr>
-        <w:t xml:space="preserve">3. System Overview</w:t>
-      </w:r>
-    </w:p>
-    <w:p>
-      <w:pPr>
-        <w:spacing w:after="160" w:line="300"/>
-        <w:jc w:val="both"/>
-      </w:pPr>
-      <w:r>
-        <w:rPr>
-          <w:rFonts w:ascii="Times New Roman" w:cs="Times New Roman" w:eastAsia="Times New Roman" w:hAnsi="Times New Roman"/>
-          <w:sz w:val="24"/>
-          <w:szCs w:val="24"/>
-        </w:rPr>
-        <w:t xml:space="preserve">Figure 1 shows the data flow. Raw satellite granules and reanalysis fields are co-registered on a storm-centred grid and persisted as one NetCDF scene per analysis time. At training time, the scenes feed two independent learning problems: a supervised problem for the U-Net proxy and an unsupervised denoising-score-matching problem for the prior. At inference time, the U-Net runs once and the sampler runs a small ensemble of reverse chains, each step of which evaluates the score network, forms the Tweedie estimate of the clean state, pushes it through the radiative-transfer operator and the thermodynamic penalty, and back-propagates the resulting cost to the noisy state.</w:t>
-      </w:r>
-    </w:p>
-    <w:p>
-      <w:pPr>
-        <w:keepNext/>
-        <w:spacing w:after="80" w:before="160"/>
         <w:jc w:val="center"/>
       </w:pPr>
       <w:r>
         <w:drawing>
           <wp:inline distT="0" distB="0" distL="0" distR="0">
-            <wp:extent cx="5943600" cy="2571750"/>
+            <wp:extent cx="1371600" cy="1143000"/>
             <wp:effectExtent t="0" r="0" b="0" l="0"/>
             <wp:docPr id="1" name="" descr="" title=""/>
             <wp:cNvGraphicFramePr>
@@ -499,6 +40,511 @@
                   <pic:spPr bwMode="auto">
                     <a:xfrm>
                       <a:off x="0" y="0"/>
+                      <a:ext cx="1371600" cy="1143000"/>
+                    </a:xfrm>
+                    <a:prstGeom prst="rect">
+                      <a:avLst/>
+                    </a:prstGeom>
+                  </pic:spPr>
+                </pic:pic>
+              </a:graphicData>
+            </a:graphic>
+          </wp:inline>
+        </w:drawing>
+      </w:r>
+    </w:p>
+    <w:p>
+      <w:pPr>
+        <w:spacing w:after="240"/>
+        <w:jc w:val="center"/>
+      </w:pPr>
+      <w:r>
+        <w:rPr>
+          <w:rFonts w:ascii="Times New Roman" w:cs="Times New Roman" w:eastAsia="Times New Roman" w:hAnsi="Times New Roman"/>
+          <w:b/>
+          <w:bCs/>
+          <w:sz w:val="44"/>
+          <w:szCs w:val="44"/>
+        </w:rPr>
+        <w:t xml:space="preserve">Vaughan: Physics-Guided Score-Based Data Assimilation for Three-Dimensional Hurricane Structure Retrieval</w:t>
+      </w:r>
+    </w:p>
+    <w:p>
+      <w:pPr>
+        <w:spacing w:after="600"/>
+        <w:jc w:val="center"/>
+      </w:pPr>
+      <w:r>
+        <w:rPr>
+          <w:rFonts w:ascii="Times New Roman" w:cs="Times New Roman" w:eastAsia="Times New Roman" w:hAnsi="Times New Roman"/>
+          <w:i/>
+          <w:iCs/>
+          <w:sz w:val="26"/>
+          <w:szCs w:val="26"/>
+        </w:rPr>
+        <w:t xml:space="preserve">Multi-modal fusion of GOES-16 infrared imagery and ATMS microwave soundings with a conditional diffusion prior and a differentiable radiative-transfer constraint, applied to Hurricane Milton (October 2024)</w:t>
+      </w:r>
+    </w:p>
+    <w:p>
+      <w:pPr>
+        <w:spacing w:after="120"/>
+        <w:jc w:val="center"/>
+      </w:pPr>
+      <w:r>
+        <w:rPr>
+          <w:rFonts w:ascii="Times New Roman" w:cs="Times New Roman" w:eastAsia="Times New Roman" w:hAnsi="Times New Roman"/>
+          <w:b/>
+          <w:bCs/>
+          <w:sz w:val="28"/>
+          <w:szCs w:val="28"/>
+        </w:rPr>
+        <w:t xml:space="preserve">Technical Report</w:t>
+      </w:r>
+    </w:p>
+    <w:p>
+      <w:pPr>
+        <w:spacing w:after="120"/>
+        <w:jc w:val="center"/>
+      </w:pPr>
+      <w:r>
+        <w:rPr>
+          <w:rFonts w:ascii="Times New Roman" w:cs="Times New Roman" w:eastAsia="Times New Roman" w:hAnsi="Times New Roman"/>
+          <w:sz w:val="24"/>
+          <w:szCs w:val="24"/>
+        </w:rPr>
+        <w:t xml:space="preserve">Platform: Vaughan. Software package: milton_da v0.2.0 (github.com/Ibekwemmanuel7/milton_da). Results dashboard: ibekwemmanuel7.github.io/milton_da/dashboard</w:t>
+      </w:r>
+    </w:p>
+    <w:p>
+      <w:pPr>
+        <w:spacing w:after="120"/>
+        <w:jc w:val="center"/>
+      </w:pPr>
+      <w:r>
+        <w:rPr>
+          <w:rFonts w:ascii="Times New Roman" w:cs="Times New Roman" w:eastAsia="Times New Roman" w:hAnsi="Times New Roman"/>
+          <w:sz w:val="24"/>
+          <w:szCs w:val="24"/>
+        </w:rPr>
+        <w:t xml:space="preserve">Author: Emmanuel Chidi Ibekwe</w:t>
+      </w:r>
+    </w:p>
+    <w:p>
+      <w:pPr>
+        <w:spacing w:after="500"/>
+        <w:jc w:val="center"/>
+      </w:pPr>
+      <w:r>
+        <w:rPr>
+          <w:rFonts w:ascii="Times New Roman" w:cs="Times New Roman" w:eastAsia="Times New Roman" w:hAnsi="Times New Roman"/>
+          <w:sz w:val="24"/>
+          <w:szCs w:val="24"/>
+        </w:rPr>
+        <w:t xml:space="preserve">September 2026</w:t>
+      </w:r>
+    </w:p>
+    <w:p>
+      <w:pPr>
+        <w:spacing w:after="120"/>
+        <w:jc w:val="center"/>
+      </w:pPr>
+      <w:r>
+        <w:rPr>
+          <w:rFonts w:ascii="Times New Roman" w:cs="Times New Roman" w:eastAsia="Times New Roman" w:hAnsi="Times New Roman"/>
+          <w:b/>
+          <w:bCs/>
+          <w:sz w:val="24"/>
+          <w:szCs w:val="24"/>
+        </w:rPr>
+        <w:t xml:space="preserve">Abstract</w:t>
+      </w:r>
+    </w:p>
+    <w:p>
+      <w:pPr>
+        <w:spacing w:after="160" w:line="300"/>
+        <w:jc w:val="both"/>
+      </w:pPr>
+      <w:r>
+        <w:rPr>
+          <w:rFonts w:ascii="Times New Roman" w:cs="Times New Roman" w:eastAsia="Times New Roman" w:hAnsi="Times New Roman"/>
+          <w:sz w:val="21"/>
+          <w:szCs w:val="21"/>
+        </w:rPr>
+        <w:t xml:space="preserve">This report documents the design, implementation, verification and real-data results of milton_da, a modular PyTorch system that reconstructs the three-dimensional temperature field (200 to 1000 hPa) and the surface precipitation field of a tropical cyclone from satellite observations alone, with no forecast model. Geostationary infrared imagery (GOES-16 ABI) and polar-orbiting microwave soundings (NOAA-20 ATMS) are co-registered on a storm-centred grid, fused by a U-Net whose infrared feature maps attend over microwave tokens, and assimilated by a physics-guided score-based diffusion sampler whose likelihood combines the U-Net proxy, a per-channel calibrated radiative-transfer operator and a static-stability constraint. Applied to 16 analysis times of Hurricane Milton (6 to 10 October 2024), with the prior and proxy trained on 805 storm-centred scenes from 2017 to 2022 and Milton held out, the 8-member analysis places the warm core at 250 to 400 hPa in 15 of 16 scenes, agrees with ERA5 to 1.0 to 2.8 K over the domain and 1.1 K in the inner core on scenes with a sounder overpass, and fits the bias-corrected ATMS sounding channels to 1.5 to 2.8 K, below the 2.5 to 3 K the reanalysis truth itself achieves. Two findings on real data shaped the final design: a channel-by-channel audit of the analytic operator against truth showed the oxygen sounding channels to be usable after a constant 14 to 23 K correction and the window channels unusable under an ice canopy, and an instrumented chain showed that likelihood guidance applied before the Tweedie estimate is meaningful drives the sampler off the data manifold, which a Tweedie-variance inflation of the observation errors and an early gate resolve (15.9 K to 1.7 K on the test scene). A three-way comparison shows the full system and the direct proxy agreeing to 0.01 K, the conclusion Tomorrow.io reported for ICGen, while a physics-only experiment shows the likelihood fitting the radiances without retraining at the cost of the resolution a 16 x 16 sounder grid cannot supply. The report closes with a guide to the results dashboard, the position of the work relative to Tomorrow.io's published sounder papers, and recommendations.</w:t>
+      </w:r>
+    </w:p>
+    <w:p>
+      <w:r>
+        <w:br w:type="page"/>
+      </w:r>
+    </w:p>
+    <w:p>
+      <w:pPr>
+        <w:spacing w:after="200"/>
+      </w:pPr>
+      <w:r>
+        <w:rPr>
+          <w:rFonts w:ascii="Times New Roman" w:cs="Times New Roman" w:eastAsia="Times New Roman" w:hAnsi="Times New Roman"/>
+          <w:b/>
+          <w:bCs/>
+          <w:sz w:val="32"/>
+          <w:szCs w:val="32"/>
+        </w:rPr>
+        <w:t xml:space="preserve">Contents</w:t>
+      </w:r>
+    </w:p>
+    <w:sdt>
+      <w:sdtPr>
+        <w:alias w:val="Contents"/>
+      </w:sdtPr>
+      <w:sdtContent>
+        <w:p>
+          <w:r>
+            <w:fldChar w:fldCharType="begin" w:dirty="true"/>
+            <w:instrText xml:space="preserve">TOC \h \o "1-2"</w:instrText>
+            <w:fldChar w:fldCharType="separate"/>
+          </w:r>
+        </w:p>
+        <w:p>
+          <w:r>
+            <w:fldChar w:fldCharType="end"/>
+          </w:r>
+        </w:p>
+      </w:sdtContent>
+    </w:sdt>
+    <w:p>
+      <w:r>
+        <w:br w:type="page"/>
+      </w:r>
+    </w:p>
+    <w:p>
+      <w:pPr>
+        <w:pStyle w:val="Heading1"/>
+        <w:spacing w:after="160" w:before="360"/>
+      </w:pPr>
+      <w:r>
+        <w:rPr>
+          <w:rFonts w:ascii="Times New Roman" w:cs="Times New Roman" w:eastAsia="Times New Roman" w:hAnsi="Times New Roman"/>
+        </w:rPr>
+        <w:t xml:space="preserve">1. Executive Summary</w:t>
+      </w:r>
+    </w:p>
+    <w:p>
+      <w:pPr>
+        <w:spacing w:after="160" w:line="300"/>
+        <w:jc w:val="both"/>
+      </w:pPr>
+      <w:r>
+        <w:rPr>
+          <w:rFonts w:ascii="Times New Roman" w:cs="Times New Roman" w:eastAsia="Times New Roman" w:hAnsi="Times New Roman"/>
+          <w:sz w:val="24"/>
+          <w:szCs w:val="24"/>
+        </w:rPr>
+        <w:t xml:space="preserve">Tropical cyclones are observed almost continuously from geostationary orbit, but only their cloud tops. The structure that determines intensity, the warm core aloft and the eyewall precipitation, is visible only to microwave sounders on polar orbiters, which pass a given storm a few times a day at a resolution of tens of kilometres. Operational centres bridge this gap with numerical weather prediction and variational data assimilation, a procedure that costs hours of supercomputer time per analysis cycle. This project replaces that procedure with a generative machine-learning inverse solver that ingests the two satellite data streams and produces a full three-dimensional diagnostic state in a few minutes on a single GPU, and it has been run end to end on real observations of Hurricane Milton, the most rapidly intensifying Gulf hurricane on record.</w:t>
+      </w:r>
+    </w:p>
+    <w:p>
+      <w:pPr>
+        <w:spacing w:after="160" w:line="300"/>
+        <w:jc w:val="both"/>
+      </w:pPr>
+      <w:r>
+        <w:rPr>
+          <w:rFonts w:ascii="Times New Roman" w:cs="Times New Roman" w:eastAsia="Times New Roman" w:hAnsi="Times New Roman"/>
+          <w:sz w:val="24"/>
+          <w:szCs w:val="24"/>
+        </w:rPr>
+        <w:t xml:space="preserve">The system has three learned or physical components. The first is a Cross-Attention U-Net that produces a deterministic multi-channel proxy of the state: the infrared image is encoded at full resolution and, at the two deepest levels of both the encoder and decoder, every infrared pixel attends over the entire grid of microwave sounder tokens, so the deep-atmosphere signal captured only by the sounder is redistributed spatially by the fine infrared texture. The second is an unconditional score-based diffusion prior trained purely on reanalysis states, which encodes what physically realised hurricane structures look like. The third is a differentiable radiative-transfer operator together with a thermodynamic penalty; both are placed inside the reverse-diffusion loop so that every sample is pulled toward states whose simulated brightness temperatures match the satellites and whose lapse rates never exceed the dry adiabat.</w:t>
+      </w:r>
+    </w:p>
+    <w:p>
+      <w:pPr>
+        <w:spacing w:after="160" w:line="300"/>
+        <w:jc w:val="both"/>
+      </w:pPr>
+      <w:r>
+        <w:rPr>
+          <w:rFonts w:ascii="Times New Roman" w:cs="Times New Roman" w:eastAsia="Times New Roman" w:hAnsi="Times New Roman"/>
+          <w:sz w:val="24"/>
+          <w:szCs w:val="24"/>
+        </w:rPr>
+        <w:t xml:space="preserve">On Milton the system works, and the path to making it work is the substance of this report. The first retrieval on real data was wrong in a diagnosable way; an audit of the observation operator against reanalysis truth sorted the satellite channels into the five that can be trusted after a constant correction and the seven that cannot be represented without cloud physics, and an instrumented sampling chain exposed a guidance schedule that pushed samples off the data manifold. With both corrected, the analysis places Milton's warm core at 250 to 400 hPa in 15 of 16 analysis times, matches ERA5 to about 1 K in the inner core where a sounder overpass exists, and fits the sounding channels to their noise floor. A three-way comparison against the direct proxy and a physics-only retrieval gives a measured answer to whether the generative step is worth its cost: not when the proxy is in distribution, which is also Tomorrow.io's finding, and yes when the proxy has not seen the observation, where the physics carries it at the cost of resolution. Section 14 is a guide to the interactive results page and Section 15 sets the work beside Tomorrow.io's published sounder papers.</w:t>
+      </w:r>
+    </w:p>
+    <w:p>
+      <w:pPr>
+        <w:spacing w:after="160" w:line="300"/>
+        <w:jc w:val="both"/>
+      </w:pPr>
+      <w:r>
+        <w:rPr>
+          <w:rFonts w:ascii="Times New Roman" w:cs="Times New Roman" w:eastAsia="Times New Roman" w:hAnsi="Times New Roman"/>
+          <w:sz w:val="24"/>
+          <w:szCs w:val="24"/>
+        </w:rPr>
+        <w:t xml:space="preserve">The package is complete and tested. It comprises about 3,000 lines across 26 modules, including an xarray-based ingestion layer with exact geostationary inverse projection, swath interpolation with coverage masks and reanalysis regridding; the two networks; a variance-preserving SDE with Tweedie denoising; the physics operators; a predictor-corrector guided sampler; training loops with mixed precision and exponential moving averages; a CLI that writes CF-compliant NetCDF analyses; an archive-access layer with drivers for the Milton case and a multi-storm training archive; and a nine-test suite that runs on a CPU in under half a minute. The remainder of this report describes each component at the level of equations and tensor shapes, presents the synthetic verification, the real-data results and their diagnosis, the dashboard guide, and the limitations that separate this prototype from an operational system.</w:t>
+      </w:r>
+    </w:p>
+    <w:p>
+      <w:pPr>
+        <w:pStyle w:val="Heading1"/>
+        <w:spacing w:after="160" w:before="360"/>
+      </w:pPr>
+      <w:r>
+        <w:rPr>
+          <w:rFonts w:ascii="Times New Roman" w:cs="Times New Roman" w:eastAsia="Times New Roman" w:hAnsi="Times New Roman"/>
+        </w:rPr>
+        <w:t xml:space="preserve">2. Scientific Motivation and Problem Statement</w:t>
+      </w:r>
+    </w:p>
+    <w:p>
+      <w:pPr>
+        <w:pStyle w:val="Heading2"/>
+        <w:spacing w:after="120" w:before="280"/>
+      </w:pPr>
+      <w:r>
+        <w:rPr>
+          <w:rFonts w:ascii="Times New Roman" w:cs="Times New Roman" w:eastAsia="Times New Roman" w:hAnsi="Times New Roman"/>
+        </w:rPr>
+        <w:t xml:space="preserve">2.1 The observational gap</w:t>
+      </w:r>
+    </w:p>
+    <w:p>
+      <w:pPr>
+        <w:spacing w:after="160" w:line="300"/>
+        <w:jc w:val="both"/>
+      </w:pPr>
+      <w:r>
+        <w:rPr>
+          <w:rFonts w:ascii="Times New Roman" w:cs="Times New Roman" w:eastAsia="Times New Roman" w:hAnsi="Times New Roman"/>
+          <w:sz w:val="24"/>
+          <w:szCs w:val="24"/>
+        </w:rPr>
+        <w:t xml:space="preserve">The Advanced Baseline Imager on GOES-16 returns a full-disk image every ten minutes and a mesoscale sector every thirty seconds, at a nadir resolution of two kilometres in the infrared. Channel 13 (10.3 micrometres) is a clean window channel whose brightness temperature is, under opaque cloud, the temperature at cloud top; channels 8 and 10 (6.2 and 7.3 micrometres) are water-vapour channels whose weighting functions peak in the upper and middle troposphere. None of these channels penetrates the cirrus canopy of a mature hurricane, so the imager sees a smooth cold shield with an eye, not the eyewall or the warm core.</w:t>
+      </w:r>
+    </w:p>
+    <w:p>
+      <w:pPr>
+        <w:spacing w:after="160" w:line="300"/>
+        <w:jc w:val="both"/>
+      </w:pPr>
+      <w:r>
+        <w:rPr>
+          <w:rFonts w:ascii="Times New Roman" w:cs="Times New Roman" w:eastAsia="Times New Roman" w:hAnsi="Times New Roman"/>
+          <w:sz w:val="24"/>
+          <w:szCs w:val="24"/>
+        </w:rPr>
+        <w:t xml:space="preserve">The Advanced Technology Microwave Sounder on Suomi-NPP, NOAA-20 and NOAA-21 measures in the 50 to 57 GHz oxygen absorption band, where ice cloud is nearly transparent. Channels 5 to 9 have weighting functions that peak from the boundary layer to the lower stratosphere, and their combination is a coarse temperature profile; channel 7 (54.4 GHz), peaking near 400 hPa, sees the warm-core anomaly directly. Higher-frequency channels at 88, 165 and 183 GHz are depressed by scattering from precipitation-sized ice and therefore map the eyewall and rainbands. The cost is resolution and cadence: the 50 GHz footprint is about 32 km at nadir and the sun-synchronous orbit yields a handful of overpasses per day, frequently with the storm at the swath edge or missed entirely.</w:t>
+      </w:r>
+    </w:p>
+    <w:p>
+      <w:pPr>
+        <w:pStyle w:val="Heading2"/>
+        <w:spacing w:after="120" w:before="280"/>
+      </w:pPr>
+      <w:r>
+        <w:rPr>
+          <w:rFonts w:ascii="Times New Roman" w:cs="Times New Roman" w:eastAsia="Times New Roman" w:hAnsi="Times New Roman"/>
+        </w:rPr>
+        <w:t xml:space="preserve">2.2 The data-assimilation bottleneck</w:t>
+      </w:r>
+    </w:p>
+    <w:p>
+      <w:pPr>
+        <w:spacing w:after="160" w:line="300"/>
+        <w:jc w:val="both"/>
+      </w:pPr>
+      <w:r>
+        <w:rPr>
+          <w:rFonts w:ascii="Times New Roman" w:cs="Times New Roman" w:eastAsia="Times New Roman" w:hAnsi="Times New Roman"/>
+          <w:sz w:val="24"/>
+          <w:szCs w:val="24"/>
+        </w:rPr>
+        <w:t xml:space="preserve">Operational analyses combine these observations with a short-range forecast through 4D-Var or ensemble Kalman methods. Both require the forward observation operator (a radiative-transfer model such as CRTM or RTTOV) and, for 4D-Var, its tangent-linear and adjoint, evaluated repeatedly inside an iterative minimisation coupled to the full forecast model. The wall-clock cost of a global cycle is measured in hours, and regional hurricane systems such as HAFS carry a similar burden. For rapidly intensifying storms, Milton being a canonical example, the analysis is stale by the time it is issued.</w:t>
+      </w:r>
+    </w:p>
+    <w:p>
+      <w:pPr>
+        <w:pStyle w:val="Heading2"/>
+        <w:spacing w:after="120" w:before="280"/>
+      </w:pPr>
+      <w:r>
+        <w:rPr>
+          <w:rFonts w:ascii="Times New Roman" w:cs="Times New Roman" w:eastAsia="Times New Roman" w:hAnsi="Times New Roman"/>
+        </w:rPr>
+        <w:t xml:space="preserve">2.3 The hallucination problem</w:t>
+      </w:r>
+    </w:p>
+    <w:p>
+      <w:pPr>
+        <w:spacing w:after="160" w:line="300"/>
+        <w:jc w:val="both"/>
+      </w:pPr>
+      <w:r>
+        <w:rPr>
+          <w:rFonts w:ascii="Times New Roman" w:cs="Times New Roman" w:eastAsia="Times New Roman" w:hAnsi="Times New Roman"/>
+          <w:sz w:val="24"/>
+          <w:szCs w:val="24"/>
+        </w:rPr>
+        <w:t xml:space="preserve">A straightforward alternative is to regress the reanalysis state directly from the satellite images with a convolutional network. Such regressors minimise a pixelwise loss and therefore return the conditional mean, which is spatially blurred wherever the observations are ambiguous; they also have no mechanism that forbids a temperature profile with a super-adiabatic layer or a precipitation field inconsistent with the cloud-top temperatures that were used to infer it. In data-assimilation language, a regressor has no background-error covariance and no observation operator. The generative approach adopted here restores both: the diffusion prior plays the role of a flow-dependent background distribution, and the radiative-transfer operator inside the likelihood plays the role of the observation term.</w:t>
+      </w:r>
+    </w:p>
+    <w:p>
+      <w:pPr>
+        <w:pStyle w:val="Heading2"/>
+        <w:spacing w:after="120" w:before="280"/>
+      </w:pPr>
+      <w:r>
+        <w:rPr>
+          <w:rFonts w:ascii="Times New Roman" w:cs="Times New Roman" w:eastAsia="Times New Roman" w:hAnsi="Times New Roman"/>
+        </w:rPr>
+        <w:t xml:space="preserve">2.4 Objectives</w:t>
+      </w:r>
+    </w:p>
+    <w:p>
+      <w:pPr>
+        <w:pStyle w:val="ListParagraph"/>
+        <w:numPr>
+          <w:ilvl w:val="0"/>
+          <w:numId w:val="2"/>
+        </w:numPr>
+        <w:spacing w:after="80" w:line="280"/>
+      </w:pPr>
+      <w:r>
+        <w:rPr>
+          <w:rFonts w:ascii="Times New Roman" w:cs="Times New Roman" w:eastAsia="Times New Roman" w:hAnsi="Times New Roman"/>
+          <w:b/>
+          <w:bCs/>
+          <w:sz w:val="24"/>
+          <w:szCs w:val="24"/>
+        </w:rPr>
+        <w:t xml:space="preserve">Multi-modal fusion. </w:t>
+      </w:r>
+      <w:r>
+        <w:rPr>
+          <w:rFonts w:ascii="Times New Roman" w:cs="Times New Roman" w:eastAsia="Times New Roman" w:hAnsi="Times New Roman"/>
+          <w:sz w:val="24"/>
+          <w:szCs w:val="24"/>
+        </w:rPr>
+        <w:t xml:space="preserve">Blend unaligned infrared and microwave grids with a Cross-Attention U-Net so that the fine infrared texture guides and up-scales the deep-atmosphere signal from the sounder.</w:t>
+      </w:r>
+    </w:p>
+    <w:p>
+      <w:pPr>
+        <w:pStyle w:val="ListParagraph"/>
+        <w:numPr>
+          <w:ilvl w:val="0"/>
+          <w:numId w:val="2"/>
+        </w:numPr>
+        <w:spacing w:after="80" w:line="280"/>
+      </w:pPr>
+      <w:r>
+        <w:rPr>
+          <w:rFonts w:ascii="Times New Roman" w:cs="Times New Roman" w:eastAsia="Times New Roman" w:hAnsi="Times New Roman"/>
+          <w:b/>
+          <w:bCs/>
+          <w:sz w:val="24"/>
+          <w:szCs w:val="24"/>
+        </w:rPr>
+        <w:t xml:space="preserve">Real-time assimilation. </w:t>
+      </w:r>
+      <w:r>
+        <w:rPr>
+          <w:rFonts w:ascii="Times New Roman" w:cs="Times New Roman" w:eastAsia="Times New Roman" w:hAnsi="Times New Roman"/>
+          <w:sz w:val="24"/>
+          <w:szCs w:val="24"/>
+        </w:rPr>
+        <w:t xml:space="preserve">Replace the variational minimisation with a conditional score-based sampler that returns a physically consistent three-dimensional grid and its uncertainty in seconds.</w:t>
+      </w:r>
+    </w:p>
+    <w:p>
+      <w:pPr>
+        <w:pStyle w:val="ListParagraph"/>
+        <w:numPr>
+          <w:ilvl w:val="0"/>
+          <w:numId w:val="2"/>
+        </w:numPr>
+        <w:spacing w:after="80" w:line="280"/>
+      </w:pPr>
+      <w:r>
+        <w:rPr>
+          <w:rFonts w:ascii="Times New Roman" w:cs="Times New Roman" w:eastAsia="Times New Roman" w:hAnsi="Times New Roman"/>
+          <w:b/>
+          <w:bCs/>
+          <w:sz w:val="24"/>
+          <w:szCs w:val="24"/>
+        </w:rPr>
+        <w:t xml:space="preserve">Physical integrity. </w:t>
+      </w:r>
+      <w:r>
+        <w:rPr>
+          <w:rFonts w:ascii="Times New Roman" w:cs="Times New Roman" w:eastAsia="Times New Roman" w:hAnsi="Times New Roman"/>
+          <w:sz w:val="24"/>
+          <w:szCs w:val="24"/>
+        </w:rPr>
+        <w:t xml:space="preserve">Enforce radiative consistency with the observed brightness temperatures and thermodynamic consistency (static stability, non-negative rain) inside the generative loop rather than as a post-hoc filter.</w:t>
+      </w:r>
+    </w:p>
+    <w:p>
+      <w:pPr>
+        <w:pStyle w:val="Heading1"/>
+        <w:spacing w:after="160" w:before="360"/>
+      </w:pPr>
+      <w:r>
+        <w:rPr>
+          <w:rFonts w:ascii="Times New Roman" w:cs="Times New Roman" w:eastAsia="Times New Roman" w:hAnsi="Times New Roman"/>
+        </w:rPr>
+        <w:t xml:space="preserve">3. System Overview</w:t>
+      </w:r>
+    </w:p>
+    <w:p>
+      <w:pPr>
+        <w:spacing w:after="160" w:line="300"/>
+        <w:jc w:val="both"/>
+      </w:pPr>
+      <w:r>
+        <w:rPr>
+          <w:rFonts w:ascii="Times New Roman" w:cs="Times New Roman" w:eastAsia="Times New Roman" w:hAnsi="Times New Roman"/>
+          <w:sz w:val="24"/>
+          <w:szCs w:val="24"/>
+        </w:rPr>
+        <w:t xml:space="preserve">Figure 1 shows the data flow. Raw satellite granules and reanalysis fields are co-registered on a storm-centred grid and persisted as one NetCDF scene per analysis time. At training time, the scenes feed two independent learning problems: a supervised problem for the U-Net proxy and an unsupervised denoising-score-matching problem for the prior. At inference time, the U-Net runs once and the sampler runs a small ensemble of reverse chains, each step of which evaluates the score network, forms the Tweedie estimate of the clean state, pushes it through the radiative-transfer operator and the thermodynamic penalty, and back-propagates the resulting cost to the noisy state.</w:t>
+      </w:r>
+    </w:p>
+    <w:p>
+      <w:pPr>
+        <w:keepNext/>
+        <w:spacing w:after="80" w:before="160"/>
+        <w:jc w:val="center"/>
+      </w:pPr>
+      <w:r>
+        <w:drawing>
+          <wp:inline distT="0" distB="0" distL="0" distR="0">
+            <wp:extent cx="5943600" cy="2571750"/>
+            <wp:effectExtent t="0" r="0" b="0" l="0"/>
+            <wp:docPr id="1" name="" descr="" title=""/>
+            <wp:cNvGraphicFramePr>
+              <a:graphicFrameLocks xmlns:a="http://schemas.openxmlformats.org/drawingml/2006/main" noChangeAspect="1"/>
+            </wp:cNvGraphicFramePr>
+            <a:graphic xmlns:a="http://schemas.openxmlformats.org/drawingml/2006/main">
+              <a:graphicData uri="http://schemas.openxmlformats.org/drawingml/2006/picture">
+                <pic:pic xmlns:pic="http://schemas.openxmlformats.org/drawingml/2006/picture">
+                  <pic:nvPicPr>
+                    <pic:cNvPr id="0" name="" descr=""/>
+                    <pic:cNvPicPr>
+                      <a:picLocks noChangeAspect="1" noChangeArrowheads="1"/>
+                    </pic:cNvPicPr>
+                  </pic:nvPicPr>
+                  <pic:blipFill>
+                    <a:blip r:embed="rId10" cstate="none"/>
+                    <a:srcRect/>
+                    <a:stretch>
+                      <a:fillRect/>
+                    </a:stretch>
+                  </pic:blipFill>
+                  <pic:spPr bwMode="auto">
+                    <a:xfrm>
+                      <a:off x="0" y="0"/>
                       <a:ext cx="5943600" cy="2571750"/>
                     </a:xfrm>
                     <a:prstGeom prst="rect">
@@ -3606,7 +3652,7 @@
                     </pic:cNvPicPr>
                   </pic:nvPicPr>
                   <pic:blipFill>
-                    <a:blip r:embed="rId10" cstate="none"/>
+                    <a:blip r:embed="rId11" cstate="none"/>
                     <a:srcRect/>
                     <a:stretch>
                       <a:fillRect/>
@@ -9415,7 +9461,7 @@
                     </pic:cNvPicPr>
                   </pic:nvPicPr>
                   <pic:blipFill>
-                    <a:blip r:embed="rId11" cstate="none"/>
+                    <a:blip r:embed="rId12" cstate="none"/>
                     <a:srcRect/>
                     <a:stretch>
                       <a:fillRect/>
@@ -10188,7 +10234,7 @@
                     </pic:cNvPicPr>
                   </pic:nvPicPr>
                   <pic:blipFill>
-                    <a:blip r:embed="rId12" cstate="none"/>
+                    <a:blip r:embed="rId13" cstate="none"/>
                     <a:srcRect/>
                     <a:stretch>
                       <a:fillRect/>
@@ -10251,7 +10297,7 @@
                     </pic:cNvPicPr>
                   </pic:nvPicPr>
                   <pic:blipFill>
-                    <a:blip r:embed="rId13" cstate="none"/>
+                    <a:blip r:embed="rId14" cstate="none"/>
                     <a:srcRect/>
                     <a:stretch>
                       <a:fillRect/>
@@ -13080,7 +13126,7 @@
                     </pic:cNvPicPr>
                   </pic:nvPicPr>
                   <pic:blipFill>
-                    <a:blip r:embed="rId14" cstate="none"/>
+                    <a:blip r:embed="rId15" cstate="none"/>
                     <a:srcRect/>
                     <a:stretch>
                       <a:fillRect/>
@@ -13143,7 +13189,7 @@
                     </pic:cNvPicPr>
                   </pic:nvPicPr>
                   <pic:blipFill>
-                    <a:blip r:embed="rId15" cstate="none"/>
+                    <a:blip r:embed="rId16" cstate="none"/>
                     <a:srcRect/>
                     <a:stretch>
                       <a:fillRect/>
@@ -13206,7 +13252,7 @@
                     </pic:cNvPicPr>
                   </pic:nvPicPr>
                   <pic:blipFill>
-                    <a:blip r:embed="rId16" cstate="none"/>
+                    <a:blip r:embed="rId17" cstate="none"/>
                     <a:srcRect/>
                     <a:stretch>
                       <a:fillRect/>
@@ -18303,7 +18349,7 @@
                     </pic:cNvPicPr>
                   </pic:nvPicPr>
                   <pic:blipFill>
-                    <a:blip r:embed="rId17" cstate="none"/>
+                    <a:blip r:embed="rId18" cstate="none"/>
                     <a:srcRect/>
                     <a:stretch>
                       <a:fillRect/>
@@ -19258,7 +19304,7 @@
                     </pic:cNvPicPr>
                   </pic:nvPicPr>
                   <pic:blipFill>
-                    <a:blip r:embed="rId18" cstate="none"/>
+                    <a:blip r:embed="rId19" cstate="none"/>
                     <a:srcRect/>
                     <a:stretch>
                       <a:fillRect/>
@@ -19346,173 +19392,6 @@
           <w:szCs w:val="24"/>
         </w:rPr>
         <w:t xml:space="preserve">The results live on a single self-contained web page, Vaughan (Milton Inside Out), served from the project repository at https://ibekwemmanuel7.github.io/milton_da/dashboard/ and kept in dashboard/index.html. It is one HTML file of about 6 MB with the GOES imagery, the retrieval fields, the audit and the comparison tables embedded, so it works offline once loaded, needs no server, and can be handed to anyone as a file or a link. This section walks through the page from top to bottom and explains, for each element, what is plotted, from which data, how the numbers were computed, how to read it, and the questions it tends to raise. It is written to be read once alongside the page and then used as a reference before a presentation.</w:t>
-      </w:r>
-    </w:p>
-    <w:p>
-      <w:pPr>
-        <w:keepNext/>
-        <w:spacing w:after="80" w:before="160"/>
-        <w:jc w:val="center"/>
-      </w:pPr>
-      <w:r>
-        <w:drawing>
-          <wp:inline distT="0" distB="0" distL="0" distR="0">
-            <wp:extent cx="5848350" cy="4876800"/>
-            <wp:effectExtent t="0" r="0" b="0" l="0"/>
-            <wp:docPr id="1" name="" descr="" title=""/>
-            <wp:cNvGraphicFramePr>
-              <a:graphicFrameLocks xmlns:a="http://schemas.openxmlformats.org/drawingml/2006/main" noChangeAspect="1"/>
-            </wp:cNvGraphicFramePr>
-            <a:graphic xmlns:a="http://schemas.openxmlformats.org/drawingml/2006/main">
-              <a:graphicData uri="http://schemas.openxmlformats.org/drawingml/2006/picture">
-                <pic:pic xmlns:pic="http://schemas.openxmlformats.org/drawingml/2006/picture">
-                  <pic:nvPicPr>
-                    <pic:cNvPr id="0" name="" descr=""/>
-                    <pic:cNvPicPr>
-                      <a:picLocks noChangeAspect="1" noChangeArrowheads="1"/>
-                    </pic:cNvPicPr>
-                  </pic:nvPicPr>
-                  <pic:blipFill>
-                    <a:blip r:embed="rId19" cstate="none"/>
-                    <a:srcRect/>
-                    <a:stretch>
-                      <a:fillRect/>
-                    </a:stretch>
-                  </pic:blipFill>
-                  <pic:spPr bwMode="auto">
-                    <a:xfrm>
-                      <a:off x="0" y="0"/>
-                      <a:ext cx="5848350" cy="4876800"/>
-                    </a:xfrm>
-                    <a:prstGeom prst="rect">
-                      <a:avLst/>
-                    </a:prstGeom>
-                  </pic:spPr>
-                </pic:pic>
-              </a:graphicData>
-            </a:graphic>
-          </wp:inline>
-        </w:drawing>
-      </w:r>
-    </w:p>
-    <w:p>
-      <w:pPr>
-        <w:spacing w:after="240"/>
-        <w:jc w:val="center"/>
-      </w:pPr>
-      <w:r>
-        <w:rPr>
-          <w:rFonts w:ascii="Times New Roman" w:cs="Times New Roman" w:eastAsia="Times New Roman" w:hAnsi="Times New Roman"/>
-          <w:i/>
-          <w:iCs/>
-          <w:sz w:val="20"/>
-          <w:szCs w:val="20"/>
-        </w:rPr>
-        <w:t xml:space="preserve">Figure 11. The top of the page: masthead, the GOES loop with its controls, and the headline tiles.</w:t>
-      </w:r>
-    </w:p>
-    <w:p>
-      <w:pPr>
-        <w:pStyle w:val="Heading2"/>
-        <w:spacing w:after="120" w:before="280"/>
-      </w:pPr>
-      <w:r>
-        <w:rPr>
-          <w:rFonts w:ascii="Times New Roman" w:cs="Times New Roman" w:eastAsia="Times New Roman" w:hAnsi="Times New Roman"/>
-        </w:rPr>
-        <w:t xml:space="preserve">14.1 How the page is built and updated</w:t>
-      </w:r>
-    </w:p>
-    <w:p>
-      <w:pPr>
-        <w:spacing w:after="160" w:line="300"/>
-        <w:jc w:val="both"/>
-      </w:pPr>
-      <w:r>
-        <w:rPr>
-          <w:rFonts w:ascii="Times New Roman" w:cs="Times New Roman" w:eastAsia="Times New Roman" w:hAnsi="Times New Roman"/>
-          <w:sz w:val="24"/>
-          <w:szCs w:val="24"/>
-        </w:rPr>
-        <w:t xml:space="preserve">Every number and image on the page is produced by code in the repository, not typed in. The export cell colab/export_dashboard_cell.py walks the run folders on Drive, reads each CF NetCDF analysis file, coarsens the two-dimensional fields to 64 x 64 (so the page stays small) and writes one JSON file with the warm-core profiles, the per-level errors, the rain errors, the ensemble spread, the observed and simulated brightness temperatures, the ERA5 and IMERG truth fields from the scene files, the operator audit and the prior samples. A build script embeds that JSON, together with the GOES imagery rendered from the raw CONUS files, into the HTML template; the charts and heat maps are drawn in the browser from the embedded data with plain SVG and canvas, no charting library. Rerunning a retrieval and the export, then rebuilding, republishes the page with the same layout; nothing else changes. The page renders in the viewer's light or dark theme and on a phone, where the panels stack.</w:t>
-      </w:r>
-    </w:p>
-    <w:p>
-      <w:pPr>
-        <w:pStyle w:val="Heading2"/>
-        <w:spacing w:after="120" w:before="280"/>
-      </w:pPr>
-      <w:r>
-        <w:rPr>
-          <w:rFonts w:ascii="Times New Roman" w:cs="Times New Roman" w:eastAsia="Times New Roman" w:hAnsi="Times New Roman"/>
-        </w:rPr>
-        <w:t xml:space="preserve">14.2 Masthead and imagery loop</w:t>
-      </w:r>
-    </w:p>
-    <w:p>
-      <w:pPr>
-        <w:spacing w:after="160" w:line="300"/>
-        <w:jc w:val="both"/>
-      </w:pPr>
-      <w:r>
-        <w:rPr>
-          <w:rFonts w:ascii="Times New Roman" w:cs="Times New Roman" w:eastAsia="Times New Roman" w:hAnsi="Times New Roman"/>
-          <w:sz w:val="24"/>
-          <w:szCs w:val="24"/>
-        </w:rPr>
-        <w:t xml:space="preserve">The masthead gives the storm, the dates, the two instruments and the author, and a one-sentence statement of the method. Below it is a looping animation of GOES-16 ABI band 13 (10.3 um) over the whole Gulf of Mexico, from 96 W to 77 W and 15 N to 31.5 N, rendered from the CONUS scan nearest each of the 16 analysis times, so the frames are the same times as everything else on the page. The colour scale is the enhanced-infrared convention forecasters use: greys from black (300 K) to light grey (243 K) for the warm surface and low cloud, then blue, cyan, green, yellow, orange, red and magenta for cloud tops colder than 243 K down to about 173 K. The eye is the warm dot inside the coloured ring; the coldest tops, red and magenta, mark the deepest convection in the eyewall. The loop plays on its own, has a pause button and a slider, and is linked to the scene explorer below: choosing a time in either place moves the other.</w:t>
-      </w:r>
-    </w:p>
-    <w:p>
-      <w:pPr>
-        <w:spacing w:after="160" w:line="300"/>
-        <w:jc w:val="both"/>
-      </w:pPr>
-      <w:r>
-        <w:rPr>
-          <w:rFonts w:ascii="Times New Roman" w:cs="Times New Roman" w:eastAsia="Times New Roman" w:hAnsi="Times New Roman"/>
-          <w:sz w:val="24"/>
-          <w:szCs w:val="24"/>
-        </w:rPr>
-        <w:t xml:space="preserve">What to point at. Rapid intensification is visible between 07 October 00Z and 12Z as the eye clears and the ring turns red; the very small eye on 07 October is the hardest resolution test in the sequence; the asymmetry and wobble on 09 October are the shear and the eyewall replacement that preceded landfall near Siesta Key at about 00:30Z on 10 October. This is the observation, and everyone in the room can read it, which makes it the place to start. The caption below the loop states the data source and the projection so nobody has to ask.</w:t>
-      </w:r>
-    </w:p>
-    <w:p>
-      <w:pPr>
-        <w:pStyle w:val="Heading2"/>
-        <w:spacing w:after="120" w:before="280"/>
-      </w:pPr>
-      <w:r>
-        <w:rPr>
-          <w:rFonts w:ascii="Times New Roman" w:cs="Times New Roman" w:eastAsia="Times New Roman" w:hAnsi="Times New Roman"/>
-        </w:rPr>
-        <w:t xml:space="preserve">14.3 Headline tiles</w:t>
-      </w:r>
-    </w:p>
-    <w:p>
-      <w:pPr>
-        <w:spacing w:after="160" w:line="300"/>
-        <w:jc w:val="both"/>
-      </w:pPr>
-      <w:r>
-        <w:rPr>
-          <w:rFonts w:ascii="Times New Roman" w:cs="Times New Roman" w:eastAsia="Times New Roman" w:hAnsi="Times New Roman"/>
-          <w:sz w:val="24"/>
-          <w:szCs w:val="24"/>
-        </w:rPr>
-        <w:t xml:space="preserve">Six figures computed on the page from the embedded results. Domain temperature RMSE against ERA5: the range across the 14 scored scenes of the root mean square difference between the 8-member mean temperature and ERA5, over all ten levels and the full 128 x 128 grid. Inner-core RMSE at 300 hPa: the same quantity at one level in an 8 x 8 box of the coarsened field, about 70 km around the best-track centre. Scenes with the warm core peaking at 250 to 400 hPa: a count of scenes whose warm-core profile has its maximum at one of those three levels. ATMS sounding-channel misfit after calibration: the root mean square difference between the bias-corrected simulated radiances of the analysis and the observed ones over channels 5 to 9, quoted with the value the ERA5 truth itself achieves so that the reader knows the floor. Analysis times with an ATMS overpass: scenes where the swath mask covers more than 30 percent of the domain. Training and validation scenes. The note beneath states the climatological caveat of Section 13.4 so that the domain RMSE is not over-read.</w:t>
-      </w:r>
-    </w:p>
-    <w:p>
-      <w:pPr>
-        <w:pStyle w:val="Heading2"/>
-        <w:spacing w:after="120" w:before="280"/>
-      </w:pPr>
-      <w:r>
-        <w:rPr>
-          <w:rFonts w:ascii="Times New Roman" w:cs="Times New Roman" w:eastAsia="Times New Roman" w:hAnsi="Times New Roman"/>
-        </w:rPr>
-        <w:t xml:space="preserve">14.4 Scene explorer</w:t>
       </w:r>
     </w:p>
     <w:p>
@@ -19575,7 +19454,19 @@
           <w:sz w:val="20"/>
           <w:szCs w:val="20"/>
         </w:rPr>
-        <w:t xml:space="preserve">Figure 12. The scene explorer for 08 October 18Z.</w:t>
+        <w:t xml:space="preserve">Figure 11. The top of the page: masthead, the GOES loop with its controls, and the headline tiles.</w:t>
+      </w:r>
+    </w:p>
+    <w:p>
+      <w:pPr>
+        <w:pStyle w:val="Heading2"/>
+        <w:spacing w:after="120" w:before="280"/>
+      </w:pPr>
+      <w:r>
+        <w:rPr>
+          <w:rFonts w:ascii="Times New Roman" w:cs="Times New Roman" w:eastAsia="Times New Roman" w:hAnsi="Times New Roman"/>
+        </w:rPr>
+        <w:t xml:space="preserve">14.1 How the page is built and updated</w:t>
       </w:r>
     </w:p>
     <w:p>
@@ -19589,193 +19480,77 @@
           <w:sz w:val="24"/>
           <w:szCs w:val="24"/>
         </w:rPr>
-        <w:t xml:space="preserve">The strip of 16 buttons selects an analysis time; a filled dot on a button means an ATMS overpass fell inside the window, an empty dot means the retrieval at that time is carried by the infrared through the proxy and the prior. Beneath the strip a row of six statistics for the chosen time: the time, the ATMS coverage as a percentage of the domain, the inner-core and domain RMSE against ERA5 (with the physics-only value for the same scene in brackets), the rain RMSE against IMERG, and the warm core at 300 hPa with ERA5's value for comparison. Then seven panels.</w:t>
+        <w:t xml:space="preserve">Every number and image on the page is produced by code in the repository, not typed in. The export cell colab/export_dashboard_cell.py walks the run folders on Drive, reads each CF NetCDF analysis file, coarsens the two-dimensional fields to 64 x 64 (so the page stays small) and writes one JSON file with the warm-core profiles, the per-level errors, the rain errors, the ensemble spread, the observed and simulated brightness temperatures, the ERA5 and IMERG truth fields from the scene files, the operator audit and the prior samples. A build script embeds that JSON, together with the GOES imagery rendered from the raw CONUS files, into the HTML template; the charts and heat maps are drawn in the browser from the embedded data with plain SVG and canvas, no charting library. Rerunning a retrieval and the export, then rebuilding, republishes the page with the same layout; nothing else changes. The page renders in the viewer's light or dark theme and on a phone, where the panels stack.</w:t>
       </w:r>
     </w:p>
     <w:p>
       <w:pPr>
-        <w:pStyle w:val="ListParagraph"/>
-        <w:numPr>
-          <w:ilvl w:val="0"/>
-          <w:numId w:val="3"/>
-        </w:numPr>
-        <w:spacing w:after="80" w:line="280"/>
+        <w:pStyle w:val="Heading2"/>
+        <w:spacing w:after="120" w:before="280"/>
       </w:pPr>
       <w:r>
         <w:rPr>
           <w:rFonts w:ascii="Times New Roman" w:cs="Times New Roman" w:eastAsia="Times New Roman" w:hAnsi="Times New Roman"/>
-          <w:b/>
-          <w:bCs/>
-          <w:sz w:val="24"/>
-          <w:szCs w:val="24"/>
-        </w:rPr>
-        <w:t xml:space="preserve">GOES-16 band 13, observed. </w:t>
-      </w:r>
+        </w:rPr>
+        <w:t xml:space="preserve">14.2 Masthead and imagery loop</w:t>
+      </w:r>
+    </w:p>
+    <w:p>
+      <w:pPr>
+        <w:spacing w:after="160" w:line="300"/>
+        <w:jc w:val="both"/>
+      </w:pPr>
       <w:r>
         <w:rPr>
           <w:rFonts w:ascii="Times New Roman" w:cs="Times New Roman" w:eastAsia="Times New Roman" w:hAnsi="Times New Roman"/>
           <w:sz w:val="24"/>
           <w:szCs w:val="24"/>
         </w:rPr>
-        <w:t xml:space="preserve">The storm-centred 512 km box at 2 km, in the same enhanced-infrared colours as the loop. This is literally the field the U-Net sees, so it is the panel to use when explaining what the proxy has to work with: a cold canopy that hides everything beneath it.</w:t>
+        <w:t xml:space="preserve">The masthead gives the storm, the dates, the two instruments and the author, and a one-sentence statement of the method. Below it is a looping animation of GOES-16 ABI band 13 (10.3 um) over the whole Gulf of Mexico, from 96 W to 77 W and 15 N to 31.5 N, rendered from the CONUS scan nearest each of the 16 analysis times, so the frames are the same times as everything else on the page. The colour scale is the enhanced-infrared convention forecasters use: greys from black (300 K) to light grey (243 K) for the warm surface and low cloud, then blue, cyan, green, yellow, orange, red and magenta for cloud tops colder than 243 K down to about 173 K. The eye is the warm dot inside the coloured ring; the coldest tops, red and magenta, mark the deepest convection in the eyewall. The loop plays on its own, has a pause button and a slider, and is linked to the scene explorer below: choosing a time in either place moves the other.</w:t>
       </w:r>
     </w:p>
     <w:p>
       <w:pPr>
-        <w:pStyle w:val="ListParagraph"/>
-        <w:numPr>
-          <w:ilvl w:val="0"/>
-          <w:numId w:val="3"/>
-        </w:numPr>
-        <w:spacing w:after="80" w:line="280"/>
-      </w:pPr>
-      <w:r>
-        <w:rPr>
-          <w:rFonts w:ascii="Times New Roman" w:cs="Times New Roman" w:eastAsia="Times New Roman" w:hAnsi="Times New Roman"/>
-          <w:b/>
-          <w:bCs/>
-          <w:sz w:val="24"/>
-          <w:szCs w:val="24"/>
-        </w:rPr>
-        <w:t xml:space="preserve">ATMS channel 7, 54.4 GHz. </w:t>
-      </w:r>
+        <w:spacing w:after="160" w:line="300"/>
+        <w:jc w:val="both"/>
+      </w:pPr>
       <w:r>
         <w:rPr>
           <w:rFonts w:ascii="Times New Roman" w:cs="Times New Roman" w:eastAsia="Times New Roman" w:hAnsi="Times New Roman"/>
           <w:sz w:val="24"/>
           <w:szCs w:val="24"/>
         </w:rPr>
-        <w:t xml:space="preserve">Observed brightness temperature on the 16 x 16 coarse grid beside the value simulated from the analysis by the analytic operator after subtracting the channel's 18.3 K bias, on a common colour scale; grey where there is no swath. Channel 7 peaks near 300 hPa, so the warm core appears as a warm spot; a good retrieval matches the observed pattern to within the 1 K scatter the audit found for this channel.</w:t>
+        <w:t xml:space="preserve">What to point at. Rapid intensification is visible between 07 October 00Z and 12Z as the eye clears and the ring turns red; the very small eye on 07 October is the hardest resolution test in the sequence; the asymmetry and wobble on 09 October are the shear and the eyewall replacement that preceded landfall near Siesta Key at about 00:30Z on 10 October. This is the observation, and everyone in the room can read it, which makes it the place to start. The caption below the loop states the data source and the projection so nobody has to ask.</w:t>
       </w:r>
     </w:p>
     <w:p>
       <w:pPr>
-        <w:pStyle w:val="ListParagraph"/>
-        <w:numPr>
-          <w:ilvl w:val="0"/>
-          <w:numId w:val="3"/>
-        </w:numPr>
-        <w:spacing w:after="80" w:line="280"/>
+        <w:pStyle w:val="Heading2"/>
+        <w:spacing w:after="120" w:before="280"/>
       </w:pPr>
       <w:r>
         <w:rPr>
           <w:rFonts w:ascii="Times New Roman" w:cs="Times New Roman" w:eastAsia="Times New Roman" w:hAnsi="Times New Roman"/>
-          <w:b/>
-          <w:bCs/>
-          <w:sz w:val="24"/>
-          <w:szCs w:val="24"/>
-        </w:rPr>
-        <w:t xml:space="preserve">Temperature anomaly at 300 hPa and at 850 hPa. </w:t>
-      </w:r>
+        </w:rPr>
+        <w:t xml:space="preserve">14.3 Headline tiles</w:t>
+      </w:r>
+    </w:p>
+    <w:p>
+      <w:pPr>
+        <w:spacing w:after="160" w:line="300"/>
+        <w:jc w:val="both"/>
+      </w:pPr>
       <w:r>
         <w:rPr>
           <w:rFonts w:ascii="Times New Roman" w:cs="Times New Roman" w:eastAsia="Times New Roman" w:hAnsi="Times New Roman"/>
           <w:sz w:val="24"/>
           <w:szCs w:val="24"/>
         </w:rPr>
-        <w:t xml:space="preserve">The analysis beside ERA5, each shown as the departure from its own domain mean, from -4 K (blue) to +4 K (red). The warm core is the red spot at 300 hPa; at 850 hPa it is weaker and the structure is dominated by the moist boundary layer. Comparing the two rows is the quickest visual check that the warm core is aloft, which the first sampler failed.</w:t>
+        <w:t xml:space="preserve">Six figures computed on the page from the embedded results. Domain temperature RMSE against ERA5: the range across the 14 scored scenes of the root mean square difference between the 8-member mean temperature and ERA5, over all ten levels and the full 128 x 128 grid. Inner-core RMSE at 300 hPa: the same quantity at one level in an 8 x 8 box of the coarsened field, about 70 km around the best-track centre. Scenes with the warm core peaking at 250 to 400 hPa: a count of scenes whose warm-core profile has its maximum at one of those three levels. ATMS sounding-channel misfit after calibration: the root mean square difference between the bias-corrected simulated radiances of the analysis and the observed ones over channels 5 to 9, quoted with the value the ERA5 truth itself achieves so that the reader knows the floor. Analysis times with an ATMS overpass: scenes where the swath mask covers more than 30 percent of the domain. Training and validation scenes. The note beneath states the climatological caveat of Section 13.4 so that the domain RMSE is not over-read.</w:t>
       </w:r>
     </w:p>
     <w:p>
       <w:pPr>
-        <w:pStyle w:val="ListParagraph"/>
-        <w:numPr>
-          <w:ilvl w:val="0"/>
-          <w:numId w:val="3"/>
-        </w:numPr>
-        <w:spacing w:after="80" w:line="280"/>
-      </w:pPr>
-      <w:r>
-        <w:rPr>
-          <w:rFonts w:ascii="Times New Roman" w:cs="Times New Roman" w:eastAsia="Times New Roman" w:hAnsi="Times New Roman"/>
-          <w:b/>
-          <w:bCs/>
-          <w:sz w:val="24"/>
-          <w:szCs w:val="24"/>
-        </w:rPr>
-        <w:t xml:space="preserve">Rain rate. </w:t>
-      </w:r>
-      <w:r>
-        <w:rPr>
-          <w:rFonts w:ascii="Times New Roman" w:cs="Times New Roman" w:eastAsia="Times New Roman" w:hAnsi="Times New Roman"/>
-          <w:sz w:val="24"/>
-          <w:szCs w:val="24"/>
-        </w:rPr>
-        <w:t xml:space="preserve">The 8-member mean rain rate beside IMERG, 0 to 30 mm/h in blues. Expect the eyewall ring and the principal rainband; IMERG at 0.1 degrees is itself a satellite estimate, so agreement in placement matters more than pixel values, and the rain RMSE of 2 to 11 mm/h is dominated by the ring's exact radius.</w:t>
-      </w:r>
-    </w:p>
-    <w:p>
-      <w:pPr>
-        <w:pStyle w:val="ListParagraph"/>
-        <w:numPr>
-          <w:ilvl w:val="0"/>
-          <w:numId w:val="3"/>
-        </w:numPr>
-        <w:spacing w:after="80" w:line="280"/>
-      </w:pPr>
-      <w:r>
-        <w:rPr>
-          <w:rFonts w:ascii="Times New Roman" w:cs="Times New Roman" w:eastAsia="Times New Roman" w:hAnsi="Times New Roman"/>
-          <w:b/>
-          <w:bCs/>
-          <w:sz w:val="24"/>
-          <w:szCs w:val="24"/>
-        </w:rPr>
-        <w:t xml:space="preserve">Ensemble spread at 300 hPa, and the physics-only field. </w:t>
-      </w:r>
-      <w:r>
-        <w:rPr>
-          <w:rFonts w:ascii="Times New Roman" w:cs="Times New Roman" w:eastAsia="Times New Roman" w:hAnsi="Times New Roman"/>
-          <w:sz w:val="24"/>
-          <w:szCs w:val="24"/>
-        </w:rPr>
-        <w:t xml:space="preserve">The standard deviation across the 8 members, 0 to 0.5 K, which on Milton is about 0.1 K everywhere because the proxy term dominates the likelihood; and the 300 hPa anomaly from the physics-only run for the same scene, so the weaker core discussed in Section 13.5 can be seen directly.</w:t>
-      </w:r>
-    </w:p>
-    <w:p>
-      <w:pPr>
-        <w:pStyle w:val="ListParagraph"/>
-        <w:numPr>
-          <w:ilvl w:val="0"/>
-          <w:numId w:val="3"/>
-        </w:numPr>
-        <w:spacing w:after="80" w:line="280"/>
-      </w:pPr>
-      <w:r>
-        <w:rPr>
-          <w:rFonts w:ascii="Times New Roman" w:cs="Times New Roman" w:eastAsia="Times New Roman" w:hAnsi="Times New Roman"/>
-          <w:b/>
-          <w:bCs/>
-          <w:sz w:val="24"/>
-          <w:szCs w:val="24"/>
-        </w:rPr>
-        <w:t xml:space="preserve">East to west cross section. </w:t>
-      </w:r>
-      <w:r>
-        <w:rPr>
-          <w:rFonts w:ascii="Times New Roman" w:cs="Times New Roman" w:eastAsia="Times New Roman" w:hAnsi="Times New Roman"/>
-          <w:sz w:val="24"/>
-          <w:szCs w:val="24"/>
-        </w:rPr>
-        <w:t xml:space="preserve">Temperature anomaly from each level's mean along the row through the storm centre, 200 hPa at the top and 1000 hPa at the bottom, analysis beside ERA5. The warm core should appear as a red column widening with height and peaking in the upper troposphere; a cold or flat column aloft is the signature of the failed first run.</w:t>
-      </w:r>
-    </w:p>
-    <w:p>
-      <w:pPr>
-        <w:spacing w:after="160" w:line="300"/>
-        <w:jc w:val="both"/>
-      </w:pPr>
-      <w:r>
-        <w:rPr>
-          <w:rFonts w:ascii="Times New Roman" w:cs="Times New Roman" w:eastAsia="Times New Roman" w:hAnsi="Times New Roman"/>
-          <w:sz w:val="24"/>
-          <w:szCs w:val="24"/>
-        </w:rPr>
-        <w:t xml:space="preserve">Below the panels is the warm-core profile for the chosen time: core-minus-environment temperature on each of the ten levels for the analysis (blue), the direct proxy (orange), the physics-only retrieval (green) and ERA5 (violet, dashed), on a logarithmic pressure axis. The definition is the one used throughout: the mean of the central 5 x 5 pixels minus the mean of all pixels farther than 48 pixels from the centre, computed on the 128 x 128 field. This is the figure that says whether the physics worked, and on any scene with ATMS it shows the three retrievals agreeing above 500 hPa and the physics-only line falling below the others in the core.</w:t>
-      </w:r>
-    </w:p>
-    <w:p>
-      <w:pPr>
         <w:pStyle w:val="Heading2"/>
         <w:spacing w:after="120" w:before="280"/>
       </w:pPr>
@@ -19783,7 +19558,7 @@
         <w:rPr>
           <w:rFonts w:ascii="Times New Roman" w:cs="Times New Roman" w:eastAsia="Times New Roman" w:hAnsi="Times New Roman"/>
         </w:rPr>
-        <w:t xml:space="preserve">14.5 Warm-core evolution</w:t>
+        <w:t xml:space="preserve">14.4 Scene explorer</w:t>
       </w:r>
     </w:p>
     <w:p>
@@ -19846,7 +19621,7 @@
           <w:sz w:val="20"/>
           <w:szCs w:val="20"/>
         </w:rPr>
-        <w:t xml:space="preserve">Figure 13. The evolution chart and the head of the per-scene table.</w:t>
+        <w:t xml:space="preserve">Figure 12. The scene explorer for 08 October 18Z.</w:t>
       </w:r>
     </w:p>
     <w:p>
@@ -19860,37 +19635,193 @@
           <w:sz w:val="24"/>
           <w:szCs w:val="24"/>
         </w:rPr>
-        <w:t xml:space="preserve">The chart plots the 300 hPa warm core for all 16 times with five series: the analysis, the direct proxy, the physics-only retrieval, the first diverged sampler (grey, flat at zero, which is the before picture) and ERA5 (dashed). Dots under the axis mark the times with an ATMS overpass; the two annotations mark peak intensity on 07 October (897 hPa) and landfall. Hovering gives every series' value at a time. Reading it: the analysis and the proxy track ERA5's rise through 08 October, and all fall away on 09 and 10 October as the core weakens under shear; the physics-only line sits below the analysis only on the ATMS scenes, and coincides elsewhere, which is exactly the signature one expects if the microwave is doing the work. The table beneath has, per scene, the ATMS coverage, the 300 hPa warm core for the analysis, the proxy and ERA5, the inner-core RMSE for the analysis, the proxy and the physics-only run, the domain RMSE for the analysis, the physics-only run and the first sampler, the rain RMSE, and the core spread. Its footnote defines every column.</w:t>
+        <w:t xml:space="preserve">The strip of 16 buttons selects an analysis time; a filled dot on a button means an ATMS overpass fell inside the window, an empty dot means the retrieval at that time is carried by the infrared through the proxy and the prior. Beneath the strip a row of six statistics for the chosen time: the time, the ATMS coverage as a percentage of the domain, the inner-core and domain RMSE against ERA5 (with the physics-only value for the same scene in brackets), the rain RMSE against IMERG, and the warm core at 300 hPa with ERA5's value for comparison. Then seven panels.</w:t>
       </w:r>
     </w:p>
     <w:p>
       <w:pPr>
-        <w:pStyle w:val="Heading2"/>
-        <w:spacing w:after="120" w:before="280"/>
+        <w:pStyle w:val="ListParagraph"/>
+        <w:numPr>
+          <w:ilvl w:val="0"/>
+          <w:numId w:val="3"/>
+        </w:numPr>
+        <w:spacing w:after="80" w:line="280"/>
       </w:pPr>
       <w:r>
         <w:rPr>
           <w:rFonts w:ascii="Times New Roman" w:cs="Times New Roman" w:eastAsia="Times New Roman" w:hAnsi="Times New Roman"/>
-        </w:rPr>
-        <w:t xml:space="preserve">14.6 Method</w:t>
-      </w:r>
-    </w:p>
-    <w:p>
-      <w:pPr>
-        <w:spacing w:after="160" w:line="300"/>
-        <w:jc w:val="both"/>
-      </w:pPr>
+          <w:b/>
+          <w:bCs/>
+          <w:sz w:val="24"/>
+          <w:szCs w:val="24"/>
+        </w:rPr>
+        <w:t xml:space="preserve">GOES-16 band 13, observed. </w:t>
+      </w:r>
       <w:r>
         <w:rPr>
           <w:rFonts w:ascii="Times New Roman" w:cs="Times New Roman" w:eastAsia="Times New Roman" w:hAnsi="Times New Roman"/>
           <w:sz w:val="24"/>
           <w:szCs w:val="24"/>
         </w:rPr>
-        <w:t xml:space="preserve">A single diagram of the pipeline: the two observation sources with their grids and coverage, the cross-attention U-Net with its validation scores and the radiance-consistency auxiliary loss, the diffusion prior with its training set and step count, the guided reverse SDE with the likelihood terms listed (proxy at sigma 0.5, ATMS 5 to 9 bias-corrected, static stability and non-negative rain, Tweedie-variance inflation, no guidance above t = 0.65), and the analysis products. The dashed arrow from ATMS to the sampler shows that the radiances enter the likelihood directly as well as through the proxy, which is the point of the physics-only experiment. Two short paragraphs beside it answer the two questions the diagram raises: why a prior at all, and why the physics is on the channels it is on.</w:t>
+        <w:t xml:space="preserve">The storm-centred 512 km box at 2 km, in the same enhanced-infrared colours as the loop. This is literally the field the U-Net sees, so it is the panel to use when explaining what the proxy has to work with: a cold canopy that hides everything beneath it.</w:t>
       </w:r>
     </w:p>
     <w:p>
       <w:pPr>
+        <w:pStyle w:val="ListParagraph"/>
+        <w:numPr>
+          <w:ilvl w:val="0"/>
+          <w:numId w:val="3"/>
+        </w:numPr>
+        <w:spacing w:after="80" w:line="280"/>
+      </w:pPr>
+      <w:r>
+        <w:rPr>
+          <w:rFonts w:ascii="Times New Roman" w:cs="Times New Roman" w:eastAsia="Times New Roman" w:hAnsi="Times New Roman"/>
+          <w:b/>
+          <w:bCs/>
+          <w:sz w:val="24"/>
+          <w:szCs w:val="24"/>
+        </w:rPr>
+        <w:t xml:space="preserve">ATMS channel 7, 54.4 GHz. </w:t>
+      </w:r>
+      <w:r>
+        <w:rPr>
+          <w:rFonts w:ascii="Times New Roman" w:cs="Times New Roman" w:eastAsia="Times New Roman" w:hAnsi="Times New Roman"/>
+          <w:sz w:val="24"/>
+          <w:szCs w:val="24"/>
+        </w:rPr>
+        <w:t xml:space="preserve">Observed brightness temperature on the 16 x 16 coarse grid beside the value simulated from the analysis by the analytic operator after subtracting the channel's 18.3 K bias, on a common colour scale; grey where there is no swath. Channel 7 peaks near 300 hPa, so the warm core appears as a warm spot; a good retrieval matches the observed pattern to within the 1 K scatter the audit found for this channel.</w:t>
+      </w:r>
+    </w:p>
+    <w:p>
+      <w:pPr>
+        <w:pStyle w:val="ListParagraph"/>
+        <w:numPr>
+          <w:ilvl w:val="0"/>
+          <w:numId w:val="3"/>
+        </w:numPr>
+        <w:spacing w:after="80" w:line="280"/>
+      </w:pPr>
+      <w:r>
+        <w:rPr>
+          <w:rFonts w:ascii="Times New Roman" w:cs="Times New Roman" w:eastAsia="Times New Roman" w:hAnsi="Times New Roman"/>
+          <w:b/>
+          <w:bCs/>
+          <w:sz w:val="24"/>
+          <w:szCs w:val="24"/>
+        </w:rPr>
+        <w:t xml:space="preserve">Temperature anomaly at 300 hPa and at 850 hPa. </w:t>
+      </w:r>
+      <w:r>
+        <w:rPr>
+          <w:rFonts w:ascii="Times New Roman" w:cs="Times New Roman" w:eastAsia="Times New Roman" w:hAnsi="Times New Roman"/>
+          <w:sz w:val="24"/>
+          <w:szCs w:val="24"/>
+        </w:rPr>
+        <w:t xml:space="preserve">The analysis beside ERA5, each shown as the departure from its own domain mean, from -4 K (blue) to +4 K (red). The warm core is the red spot at 300 hPa; at 850 hPa it is weaker and the structure is dominated by the moist boundary layer. Comparing the two rows is the quickest visual check that the warm core is aloft, which the first sampler failed.</w:t>
+      </w:r>
+    </w:p>
+    <w:p>
+      <w:pPr>
+        <w:pStyle w:val="ListParagraph"/>
+        <w:numPr>
+          <w:ilvl w:val="0"/>
+          <w:numId w:val="3"/>
+        </w:numPr>
+        <w:spacing w:after="80" w:line="280"/>
+      </w:pPr>
+      <w:r>
+        <w:rPr>
+          <w:rFonts w:ascii="Times New Roman" w:cs="Times New Roman" w:eastAsia="Times New Roman" w:hAnsi="Times New Roman"/>
+          <w:b/>
+          <w:bCs/>
+          <w:sz w:val="24"/>
+          <w:szCs w:val="24"/>
+        </w:rPr>
+        <w:t xml:space="preserve">Rain rate. </w:t>
+      </w:r>
+      <w:r>
+        <w:rPr>
+          <w:rFonts w:ascii="Times New Roman" w:cs="Times New Roman" w:eastAsia="Times New Roman" w:hAnsi="Times New Roman"/>
+          <w:sz w:val="24"/>
+          <w:szCs w:val="24"/>
+        </w:rPr>
+        <w:t xml:space="preserve">The 8-member mean rain rate beside IMERG, 0 to 30 mm/h in blues. Expect the eyewall ring and the principal rainband; IMERG at 0.1 degrees is itself a satellite estimate, so agreement in placement matters more than pixel values, and the rain RMSE of 2 to 11 mm/h is dominated by the ring's exact radius.</w:t>
+      </w:r>
+    </w:p>
+    <w:p>
+      <w:pPr>
+        <w:pStyle w:val="ListParagraph"/>
+        <w:numPr>
+          <w:ilvl w:val="0"/>
+          <w:numId w:val="3"/>
+        </w:numPr>
+        <w:spacing w:after="80" w:line="280"/>
+      </w:pPr>
+      <w:r>
+        <w:rPr>
+          <w:rFonts w:ascii="Times New Roman" w:cs="Times New Roman" w:eastAsia="Times New Roman" w:hAnsi="Times New Roman"/>
+          <w:b/>
+          <w:bCs/>
+          <w:sz w:val="24"/>
+          <w:szCs w:val="24"/>
+        </w:rPr>
+        <w:t xml:space="preserve">Ensemble spread at 300 hPa, and the physics-only field. </w:t>
+      </w:r>
+      <w:r>
+        <w:rPr>
+          <w:rFonts w:ascii="Times New Roman" w:cs="Times New Roman" w:eastAsia="Times New Roman" w:hAnsi="Times New Roman"/>
+          <w:sz w:val="24"/>
+          <w:szCs w:val="24"/>
+        </w:rPr>
+        <w:t xml:space="preserve">The standard deviation across the 8 members, 0 to 0.5 K, which on Milton is about 0.1 K everywhere because the proxy term dominates the likelihood; and the 300 hPa anomaly from the physics-only run for the same scene, so the weaker core discussed in Section 13.5 can be seen directly.</w:t>
+      </w:r>
+    </w:p>
+    <w:p>
+      <w:pPr>
+        <w:pStyle w:val="ListParagraph"/>
+        <w:numPr>
+          <w:ilvl w:val="0"/>
+          <w:numId w:val="3"/>
+        </w:numPr>
+        <w:spacing w:after="80" w:line="280"/>
+      </w:pPr>
+      <w:r>
+        <w:rPr>
+          <w:rFonts w:ascii="Times New Roman" w:cs="Times New Roman" w:eastAsia="Times New Roman" w:hAnsi="Times New Roman"/>
+          <w:b/>
+          <w:bCs/>
+          <w:sz w:val="24"/>
+          <w:szCs w:val="24"/>
+        </w:rPr>
+        <w:t xml:space="preserve">East to west cross section. </w:t>
+      </w:r>
+      <w:r>
+        <w:rPr>
+          <w:rFonts w:ascii="Times New Roman" w:cs="Times New Roman" w:eastAsia="Times New Roman" w:hAnsi="Times New Roman"/>
+          <w:sz w:val="24"/>
+          <w:szCs w:val="24"/>
+        </w:rPr>
+        <w:t xml:space="preserve">Temperature anomaly from each level's mean along the row through the storm centre, 200 hPa at the top and 1000 hPa at the bottom, analysis beside ERA5. The warm core should appear as a red column widening with height and peaking in the upper troposphere; a cold or flat column aloft is the signature of the failed first run.</w:t>
+      </w:r>
+    </w:p>
+    <w:p>
+      <w:pPr>
+        <w:spacing w:after="160" w:line="300"/>
+        <w:jc w:val="both"/>
+      </w:pPr>
+      <w:r>
+        <w:rPr>
+          <w:rFonts w:ascii="Times New Roman" w:cs="Times New Roman" w:eastAsia="Times New Roman" w:hAnsi="Times New Roman"/>
+          <w:sz w:val="24"/>
+          <w:szCs w:val="24"/>
+        </w:rPr>
+        <w:t xml:space="preserve">Below the panels is the warm-core profile for the chosen time: core-minus-environment temperature on each of the ten levels for the analysis (blue), the direct proxy (orange), the physics-only retrieval (green) and ERA5 (violet, dashed), on a logarithmic pressure axis. The definition is the one used throughout: the mean of the central 5 x 5 pixels minus the mean of all pixels farther than 48 pixels from the centre, computed on the 128 x 128 field. This is the figure that says whether the physics worked, and on any scene with ATMS it shows the three retrievals agreeing above 500 hPa and the physics-only line falling below the others in the core.</w:t>
+      </w:r>
+    </w:p>
+    <w:p>
+      <w:pPr>
         <w:pStyle w:val="Heading2"/>
         <w:spacing w:after="120" w:before="280"/>
       </w:pPr>
@@ -19898,7 +19829,7 @@
         <w:rPr>
           <w:rFonts w:ascii="Times New Roman" w:cs="Times New Roman" w:eastAsia="Times New Roman" w:hAnsi="Times New Roman"/>
         </w:rPr>
-        <w:t xml:space="preserve">14.7 Diagnostics</w:t>
+        <w:t xml:space="preserve">14.5 Warm-core evolution</w:t>
       </w:r>
     </w:p>
     <w:p>
@@ -19927,6 +19858,121 @@
                   </pic:nvPicPr>
                   <pic:blipFill>
                     <a:blip r:embed="rId22" cstate="none"/>
+                    <a:srcRect/>
+                    <a:stretch>
+                      <a:fillRect/>
+                    </a:stretch>
+                  </pic:blipFill>
+                  <pic:spPr bwMode="auto">
+                    <a:xfrm>
+                      <a:off x="0" y="0"/>
+                      <a:ext cx="5848350" cy="4876800"/>
+                    </a:xfrm>
+                    <a:prstGeom prst="rect">
+                      <a:avLst/>
+                    </a:prstGeom>
+                  </pic:spPr>
+                </pic:pic>
+              </a:graphicData>
+            </a:graphic>
+          </wp:inline>
+        </w:drawing>
+      </w:r>
+    </w:p>
+    <w:p>
+      <w:pPr>
+        <w:spacing w:after="240"/>
+        <w:jc w:val="center"/>
+      </w:pPr>
+      <w:r>
+        <w:rPr>
+          <w:rFonts w:ascii="Times New Roman" w:cs="Times New Roman" w:eastAsia="Times New Roman" w:hAnsi="Times New Roman"/>
+          <w:i/>
+          <w:iCs/>
+          <w:sz w:val="20"/>
+          <w:szCs w:val="20"/>
+        </w:rPr>
+        <w:t xml:space="preserve">Figure 13. The evolution chart and the head of the per-scene table.</w:t>
+      </w:r>
+    </w:p>
+    <w:p>
+      <w:pPr>
+        <w:spacing w:after="160" w:line="300"/>
+        <w:jc w:val="both"/>
+      </w:pPr>
+      <w:r>
+        <w:rPr>
+          <w:rFonts w:ascii="Times New Roman" w:cs="Times New Roman" w:eastAsia="Times New Roman" w:hAnsi="Times New Roman"/>
+          <w:sz w:val="24"/>
+          <w:szCs w:val="24"/>
+        </w:rPr>
+        <w:t xml:space="preserve">The chart plots the 300 hPa warm core for all 16 times with five series: the analysis, the direct proxy, the physics-only retrieval, the first diverged sampler (grey, flat at zero, which is the before picture) and ERA5 (dashed). Dots under the axis mark the times with an ATMS overpass; the two annotations mark peak intensity on 07 October (897 hPa) and landfall. Hovering gives every series' value at a time. Reading it: the analysis and the proxy track ERA5's rise through 08 October, and all fall away on 09 and 10 October as the core weakens under shear; the physics-only line sits below the analysis only on the ATMS scenes, and coincides elsewhere, which is exactly the signature one expects if the microwave is doing the work. The table beneath has, per scene, the ATMS coverage, the 300 hPa warm core for the analysis, the proxy and ERA5, the inner-core RMSE for the analysis, the proxy and the physics-only run, the domain RMSE for the analysis, the physics-only run and the first sampler, the rain RMSE, and the core spread. Its footnote defines every column.</w:t>
+      </w:r>
+    </w:p>
+    <w:p>
+      <w:pPr>
+        <w:pStyle w:val="Heading2"/>
+        <w:spacing w:after="120" w:before="280"/>
+      </w:pPr>
+      <w:r>
+        <w:rPr>
+          <w:rFonts w:ascii="Times New Roman" w:cs="Times New Roman" w:eastAsia="Times New Roman" w:hAnsi="Times New Roman"/>
+        </w:rPr>
+        <w:t xml:space="preserve">14.6 Method</w:t>
+      </w:r>
+    </w:p>
+    <w:p>
+      <w:pPr>
+        <w:spacing w:after="160" w:line="300"/>
+        <w:jc w:val="both"/>
+      </w:pPr>
+      <w:r>
+        <w:rPr>
+          <w:rFonts w:ascii="Times New Roman" w:cs="Times New Roman" w:eastAsia="Times New Roman" w:hAnsi="Times New Roman"/>
+          <w:sz w:val="24"/>
+          <w:szCs w:val="24"/>
+        </w:rPr>
+        <w:t xml:space="preserve">A single diagram of the pipeline: the two observation sources with their grids and coverage, the cross-attention U-Net with its validation scores and the radiance-consistency auxiliary loss, the diffusion prior with its training set and step count, the guided reverse SDE with the likelihood terms listed (proxy at sigma 0.5, ATMS 5 to 9 bias-corrected, static stability and non-negative rain, Tweedie-variance inflation, no guidance above t = 0.65), and the analysis products. The dashed arrow from ATMS to the sampler shows that the radiances enter the likelihood directly as well as through the proxy, which is the point of the physics-only experiment. Two short paragraphs beside it answer the two questions the diagram raises: why a prior at all, and why the physics is on the channels it is on.</w:t>
+      </w:r>
+    </w:p>
+    <w:p>
+      <w:pPr>
+        <w:pStyle w:val="Heading2"/>
+        <w:spacing w:after="120" w:before="280"/>
+      </w:pPr>
+      <w:r>
+        <w:rPr>
+          <w:rFonts w:ascii="Times New Roman" w:cs="Times New Roman" w:eastAsia="Times New Roman" w:hAnsi="Times New Roman"/>
+        </w:rPr>
+        <w:t xml:space="preserve">14.7 Diagnostics</w:t>
+      </w:r>
+    </w:p>
+    <w:p>
+      <w:pPr>
+        <w:keepNext/>
+        <w:spacing w:after="80" w:before="160"/>
+        <w:jc w:val="center"/>
+      </w:pPr>
+      <w:r>
+        <w:drawing>
+          <wp:inline distT="0" distB="0" distL="0" distR="0">
+            <wp:extent cx="5848350" cy="4876800"/>
+            <wp:effectExtent t="0" r="0" b="0" l="0"/>
+            <wp:docPr id="1" name="" descr="" title=""/>
+            <wp:cNvGraphicFramePr>
+              <a:graphicFrameLocks xmlns:a="http://schemas.openxmlformats.org/drawingml/2006/main" noChangeAspect="1"/>
+            </wp:cNvGraphicFramePr>
+            <a:graphic xmlns:a="http://schemas.openxmlformats.org/drawingml/2006/main">
+              <a:graphicData uri="http://schemas.openxmlformats.org/drawingml/2006/picture">
+                <pic:pic xmlns:pic="http://schemas.openxmlformats.org/drawingml/2006/picture">
+                  <pic:nvPicPr>
+                    <pic:cNvPr id="0" name="" descr=""/>
+                    <pic:cNvPicPr>
+                      <a:picLocks noChangeAspect="1" noChangeArrowheads="1"/>
+                    </pic:cNvPicPr>
+                  </pic:nvPicPr>
+                  <pic:blipFill>
+                    <a:blip r:embed="rId23" cstate="none"/>
                     <a:srcRect/>
                     <a:stretch>
                       <a:fillRect/>

</xml_diff>

<commit_message>
Rename the package to vaughan and move it into vaughan/; repository name unchanged
</commit_message>
<xml_diff>
--- a/docs/milton_da_technical_report.docx
+++ b/docs/milton_da_technical_report.docx
@@ -112,7 +112,7 @@
           <w:sz w:val="24"/>
           <w:szCs w:val="24"/>
         </w:rPr>
-        <w:t xml:space="preserve">Platform: Vaughan. Software package: milton_da v0.2.0 (github.com/Ibekwemmanuel7/milton_da). Results dashboard: ibekwemmanuel7.github.io/milton_da/dashboard</w:t>
+        <w:t xml:space="preserve">Platform: Vaughan. Software package: vaughan v0.3.0 (repository github.com/Ibekwemmanuel7/milton_da). Results dashboard: ibekwemmanuel7.github.io/milton_da/dashboard</w:t>
       </w:r>
     </w:p>
     <w:p>
@@ -170,7 +170,7 @@
           <w:sz w:val="21"/>
           <w:szCs w:val="21"/>
         </w:rPr>
-        <w:t xml:space="preserve">This report documents the design, implementation, verification and real-data results of milton_da, a modular PyTorch system that reconstructs the three-dimensional temperature field (200 to 1000 hPa) and the surface precipitation field of a tropical cyclone from satellite observations alone, with no forecast model. Geostationary infrared imagery (GOES-16 ABI) and polar-orbiting microwave soundings (NOAA-20 ATMS) are co-registered on a storm-centred grid, fused by a U-Net whose infrared feature maps attend over microwave tokens, and assimilated by a physics-guided score-based diffusion sampler whose likelihood combines the U-Net proxy, a per-channel calibrated radiative-transfer operator and a static-stability constraint. Applied to 16 analysis times of Hurricane Milton (6 to 10 October 2024), with the prior and proxy trained on 805 storm-centred scenes from 2017 to 2022 and Milton held out, the 8-member analysis places the warm core at 250 to 400 hPa in 15 of 16 scenes, agrees with ERA5 to 1.0 to 2.8 K over the domain and 1.1 K in the inner core on scenes with a sounder overpass, and fits the bias-corrected ATMS sounding channels to 1.5 to 2.8 K, below the 2.5 to 3 K the reanalysis truth itself achieves. Two findings on real data shaped the final design: a channel-by-channel audit of the analytic operator against truth showed the oxygen sounding channels to be usable after a constant 14 to 23 K correction and the window channels unusable under an ice canopy, and an instrumented chain showed that likelihood guidance applied before the Tweedie estimate is meaningful drives the sampler off the data manifold, which a Tweedie-variance inflation of the observation errors and an early gate resolve (15.9 K to 1.7 K on the test scene). A three-way comparison shows the full system and the direct proxy agreeing to 0.01 K, the conclusion Tomorrow.io reported for ICGen, while a physics-only experiment shows the likelihood fitting the radiances without retraining at the cost of the resolution a 16 x 16 sounder grid cannot supply. The report closes with a guide to the results dashboard, the position of the work relative to Tomorrow.io's published sounder papers, and recommendations.</w:t>
+        <w:t xml:space="preserve">This report documents the design, implementation, verification and real-data results of vaughan, a modular PyTorch system that reconstructs the three-dimensional temperature field (200 to 1000 hPa) and the surface precipitation field of a tropical cyclone from satellite observations alone, with no forecast model. Geostationary infrared imagery (GOES-16 ABI) and polar-orbiting microwave soundings (NOAA-20 ATMS) are co-registered on a storm-centred grid, fused by a U-Net whose infrared feature maps attend over microwave tokens, and assimilated by a physics-guided score-based diffusion sampler whose likelihood combines the U-Net proxy, a per-channel calibrated radiative-transfer operator and a static-stability constraint. Applied to 16 analysis times of Hurricane Milton (6 to 10 October 2024), with the prior and proxy trained on 805 storm-centred scenes from 2017 to 2022 and Milton held out, the 8-member analysis places the warm core at 250 to 400 hPa in 15 of 16 scenes, agrees with ERA5 to 1.0 to 2.8 K over the domain and 1.1 K in the inner core on scenes with a sounder overpass, and fits the bias-corrected ATMS sounding channels to 1.5 to 2.8 K, below the 2.5 to 3 K the reanalysis truth itself achieves. Two findings on real data shaped the final design: a channel-by-channel audit of the analytic operator against truth showed the oxygen sounding channels to be usable after a constant 14 to 23 K correction and the window channels unusable under an ice canopy, and an instrumented chain showed that likelihood guidance applied before the Tweedie estimate is meaningful drives the sampler off the data manifold, which a Tweedie-variance inflation of the observation errors and an early gate resolve (15.9 K to 1.7 K on the test scene). A three-way comparison shows the full system and the direct proxy agreeing to 0.01 K, the conclusion Tomorrow.io reported for ICGen, while a physics-only experiment shows the likelihood fitting the radiances without retraining at the cost of the resolution a 16 x 16 sounder grid cannot supply. The report closes with a guide to the results dashboard, the position of the work relative to Tomorrow.io's published sounder papers, and recommendations.</w:t>
       </w:r>
     </w:p>
     <w:p>
@@ -571,7 +571,7 @@
           <w:sz w:val="20"/>
           <w:szCs w:val="20"/>
         </w:rPr>
-        <w:t xml:space="preserve">Figure 1. End-to-end architecture of milton_da. Blue boxes carry observations, orange boxes carry the learned state prior and its labels, green boxes are physics operators and outputs, and the yellow box is the generative data-assimilation step.</w:t>
+        <w:t xml:space="preserve">Figure 1. End-to-end architecture of vaughan. Blue boxes carry observations, orange boxes carry the learned state prior and its labels, green boxes are physics operators and outputs, and the yellow box is the generative data-assimilation step.</w:t>
       </w:r>
     </w:p>
     <w:p>
@@ -20815,7 +20815,7 @@
           <w:sz w:val="24"/>
           <w:szCs w:val="24"/>
         </w:rPr>
-        <w:t xml:space="preserve">milton_da set out to reconstruct the three-dimensional structure of Hurricane Milton from two satellites and no forecast model, and it does: the warm core sits at 250 to 400 hPa in 15 of 16 analysis times, the analysis is within 1.0 to 2.8 K of ERA5 over the domain and 1.1 K in the inner core on the scenes with a sounder overpass, and the sounding channels are fitted to their noise floor. The two findings on the way are the part of the work that generalises. An analytic observation operator must be audited channel by channel against truth before it enters a likelihood, and on real data the audit sorted the channels cleanly into ones that need a constant correction and ones the physics cannot represent; and likelihood guidance in a diffusion sampler must be scheduled with the reliability of the clean-state estimate, or a coherent push of a hundredth of a unit per step will carry the chain off the manifold. On the question of whether the generative step is worth its cost, the answer on Milton is measured rather than flattering: with a microwave-aware proxy in distribution the posterior collapses onto it, as Tomorrow.io found for ICGen; the physics term earns its place where the proxy has not seen the observation, fitting the radiances without retraining and losing only the resolution a 16 x 16 sounder grid cannot supply. The dashboard, the report and the repository together are the record of that argument, and the recommendations of Section 15 are where it points.</w:t>
+        <w:t xml:space="preserve">vaughan set out to reconstruct the three-dimensional structure of Hurricane Milton from two satellites and no forecast model, and it does: the warm core sits at 250 to 400 hPa in 15 of 16 analysis times, the analysis is within 1.0 to 2.8 K of ERA5 over the domain and 1.1 K in the inner core on the scenes with a sounder overpass, and the sounding channels are fitted to their noise floor. The two findings on the way are the part of the work that generalises. An analytic observation operator must be audited channel by channel against truth before it enters a likelihood, and on real data the audit sorted the channels cleanly into ones that need a constant correction and ones the physics cannot represent; and likelihood guidance in a diffusion sampler must be scheduled with the reliability of the clean-state estimate, or a coherent push of a hundredth of a unit per step will carry the chain off the manifold. On the question of whether the generative step is worth its cost, the answer on Milton is measured rather than flattering: with a microwave-aware proxy in distribution the posterior collapses onto it, as Tomorrow.io found for ICGen; the physics term earns its place where the proxy has not seen the observation, fitting the radiances without retraining and losing only the resolution a 16 x 16 sounder grid cannot supply. The dashboard, the report and the repository together are the record of that argument, and the recommendations of Section 15 are where it points.</w:t>
       </w:r>
     </w:p>
     <w:p>
@@ -27091,7 +27091,7 @@
                 <w:sz w:val="20"/>
                 <w:szCs w:val="20"/>
               </w:rPr>
-              <w:t xml:space="preserve">The simplified, differentiable operator in milton_da that maps the temperature and rain state to brightness temperatures without a cloud variable.</w:t>
+              <w:t xml:space="preserve">The simplified, differentiable operator in vaughan that maps the temperature and rain state to brightness temperatures without a cloud variable.</w:t>
             </w:r>
           </w:p>
         </w:tc>
@@ -30693,7 +30693,7 @@
                 <w:sz w:val="20"/>
                 <w:szCs w:val="20"/>
               </w:rPr>
-              <w:t xml:space="preserve">milton_da</w:t>
+              <w:t xml:space="preserve">vaughan</w:t>
             </w:r>
           </w:p>
         </w:tc>
@@ -31534,7 +31534,7 @@
         <w:sz w:val="18"/>
         <w:szCs w:val="18"/>
       </w:rPr>
-      <w:t xml:space="preserve">Vaughan (milton_da) technical report</w:t>
+      <w:t xml:space="preserve">Vaughan technical report</w:t>
     </w:r>
   </w:p>
 </w:hdr>

</xml_diff>